<commit_message>
Aggiornata la relazione .doxc (non ancora terminata) e rimosse alcuni campi inutilizzati nella struct Config
</commit_message>
<xml_diff>
--- a/Progetto/RelazioneSO.docx
+++ b/Progetto/RelazioneSO.docx
@@ -203,12 +203,6 @@
           <w:color w:val="156082" w:themeColor="accent1"/>
         </w:rPr>
       </w:pPr>
-      <w:r>
-        <w:rPr>
-          <w:color w:val="156082" w:themeColor="accent1"/>
-        </w:rPr>
-        <w:t>Progetto di Sistemi Operativi</w:t>
-      </w:r>
     </w:p>
     <w:p>
       <w:pPr>
@@ -216,11 +210,34 @@
         <w:jc w:val="center"/>
         <w:rPr>
           <w:color w:val="156082" w:themeColor="accent1"/>
+          <w:sz w:val="72"/>
+          <w:szCs w:val="72"/>
         </w:rPr>
       </w:pPr>
       <w:r>
         <w:rPr>
           <w:color w:val="156082" w:themeColor="accent1"/>
+          <w:sz w:val="72"/>
+          <w:szCs w:val="72"/>
+        </w:rPr>
+        <w:t>Progetto di Sistemi Operativi</w:t>
+      </w:r>
+    </w:p>
+    <w:p>
+      <w:pPr>
+        <w:pStyle w:val="Titolo"/>
+        <w:jc w:val="center"/>
+        <w:rPr>
+          <w:color w:val="156082" w:themeColor="accent1"/>
+          <w:sz w:val="72"/>
+          <w:szCs w:val="72"/>
+        </w:rPr>
+      </w:pPr>
+      <w:r>
+        <w:rPr>
+          <w:color w:val="156082" w:themeColor="accent1"/>
+          <w:sz w:val="72"/>
+          <w:szCs w:val="72"/>
         </w:rPr>
         <w:t>A.A 2024/25</w:t>
       </w:r>
@@ -230,17 +247,25 @@
         <w:pStyle w:val="Sottotitolo"/>
         <w:jc w:val="center"/>
         <w:rPr>
-          <w:sz w:val="36"/>
-          <w:szCs w:val="36"/>
-        </w:rPr>
-      </w:pPr>
-      <w:r>
-        <w:rPr>
-          <w:sz w:val="36"/>
-          <w:szCs w:val="36"/>
+          <w:sz w:val="40"/>
+          <w:szCs w:val="40"/>
+        </w:rPr>
+      </w:pPr>
+      <w:r>
+        <w:rPr>
+          <w:sz w:val="40"/>
+          <w:szCs w:val="40"/>
         </w:rPr>
         <w:t>Simulazione di un Ufficio Postale</w:t>
       </w:r>
+    </w:p>
+    <w:p>
+      <w:pPr>
+        <w:jc w:val="both"/>
+        <w:rPr>
+          <w:rFonts w:ascii="Calibri" w:hAnsi="Calibri" w:cs="Calibri"/>
+        </w:rPr>
+      </w:pPr>
     </w:p>
     <w:p>
       <w:pPr>
@@ -340,7 +365,7 @@
             </w:rPr>
             <w:fldChar w:fldCharType="separate"/>
           </w:r>
-          <w:hyperlink w:anchor="_Toc204443700" w:history="1">
+          <w:hyperlink w:anchor="_Toc204615396" w:history="1">
             <w:r>
               <w:rPr>
                 <w:rStyle w:val="Collegamentoipertestuale"/>
@@ -370,7 +395,7 @@
                 <w:noProof/>
                 <w:webHidden/>
               </w:rPr>
-              <w:instrText xml:space="preserve"> PAGEREF _Toc204443700 \h </w:instrText>
+              <w:instrText xml:space="preserve"> PAGEREF _Toc204615396 \h </w:instrText>
             </w:r>
             <w:r>
               <w:rPr>
@@ -413,7 +438,7 @@
               <w:lang w:eastAsia="it-IT"/>
             </w:rPr>
           </w:pPr>
-          <w:hyperlink w:anchor="_Toc204443701" w:history="1">
+          <w:hyperlink w:anchor="_Toc204615397" w:history="1">
             <w:r>
               <w:rPr>
                 <w:rStyle w:val="Collegamentoipertestuale"/>
@@ -443,7 +468,7 @@
                 <w:noProof/>
                 <w:webHidden/>
               </w:rPr>
-              <w:instrText xml:space="preserve"> PAGEREF _Toc204443701 \h </w:instrText>
+              <w:instrText xml:space="preserve"> PAGEREF _Toc204615397 \h </w:instrText>
             </w:r>
             <w:r>
               <w:rPr>
@@ -486,7 +511,7 @@
               <w:lang w:eastAsia="it-IT"/>
             </w:rPr>
           </w:pPr>
-          <w:hyperlink w:anchor="_Toc204443702" w:history="1">
+          <w:hyperlink w:anchor="_Toc204615398" w:history="1">
             <w:r>
               <w:rPr>
                 <w:rStyle w:val="Collegamentoipertestuale"/>
@@ -516,7 +541,7 @@
                 <w:noProof/>
                 <w:webHidden/>
               </w:rPr>
-              <w:instrText xml:space="preserve"> PAGEREF _Toc204443702 \h </w:instrText>
+              <w:instrText xml:space="preserve"> PAGEREF _Toc204615398 \h </w:instrText>
             </w:r>
             <w:r>
               <w:rPr>
@@ -536,7 +561,7 @@
                 <w:noProof/>
                 <w:webHidden/>
               </w:rPr>
-              <w:t>4</w:t>
+              <w:t>5</w:t>
             </w:r>
             <w:r>
               <w:rPr>
@@ -559,7 +584,7 @@
               <w:lang w:eastAsia="it-IT"/>
             </w:rPr>
           </w:pPr>
-          <w:hyperlink w:anchor="_Toc204443703" w:history="1">
+          <w:hyperlink w:anchor="_Toc204615399" w:history="1">
             <w:r>
               <w:rPr>
                 <w:rStyle w:val="Collegamentoipertestuale"/>
@@ -589,7 +614,7 @@
                 <w:noProof/>
                 <w:webHidden/>
               </w:rPr>
-              <w:instrText xml:space="preserve"> PAGEREF _Toc204443703 \h </w:instrText>
+              <w:instrText xml:space="preserve"> PAGEREF _Toc204615399 \h </w:instrText>
             </w:r>
             <w:r>
               <w:rPr>
@@ -609,7 +634,7 @@
                 <w:noProof/>
                 <w:webHidden/>
               </w:rPr>
-              <w:t>5</w:t>
+              <w:t>6</w:t>
             </w:r>
             <w:r>
               <w:rPr>
@@ -632,7 +657,7 @@
               <w:lang w:eastAsia="it-IT"/>
             </w:rPr>
           </w:pPr>
-          <w:hyperlink w:anchor="_Toc204443704" w:history="1">
+          <w:hyperlink w:anchor="_Toc204615400" w:history="1">
             <w:r>
               <w:rPr>
                 <w:rStyle w:val="Collegamentoipertestuale"/>
@@ -662,7 +687,7 @@
                 <w:noProof/>
                 <w:webHidden/>
               </w:rPr>
-              <w:instrText xml:space="preserve"> PAGEREF _Toc204443704 \h </w:instrText>
+              <w:instrText xml:space="preserve"> PAGEREF _Toc204615400 \h </w:instrText>
             </w:r>
             <w:r>
               <w:rPr>
@@ -682,7 +707,7 @@
                 <w:noProof/>
                 <w:webHidden/>
               </w:rPr>
-              <w:t>6</w:t>
+              <w:t>7</w:t>
             </w:r>
             <w:r>
               <w:rPr>
@@ -739,7 +764,7 @@
           <w:szCs w:val="36"/>
         </w:rPr>
       </w:pPr>
-      <w:bookmarkStart w:id="0" w:name="_Toc204443700"/>
+      <w:bookmarkStart w:id="0" w:name="_Toc204615396"/>
       <w:r>
         <w:rPr>
           <w:rFonts w:asciiTheme="majorHAnsi" w:hAnsiTheme="majorHAnsi"/>
@@ -1506,7 +1531,7 @@
           <w:szCs w:val="44"/>
         </w:rPr>
       </w:pPr>
-      <w:bookmarkStart w:id="1" w:name="_Toc204443701"/>
+      <w:bookmarkStart w:id="1" w:name="_Toc204615397"/>
       <w:r>
         <w:rPr>
           <w:rFonts w:cs="Calibri"/>
@@ -1528,181 +1553,1903 @@
           <w:rFonts w:cs="Calibri"/>
         </w:rPr>
       </w:pPr>
-      <w:proofErr w:type="spellStart"/>
-      <w:r>
-        <w:rPr>
-          <w:rFonts w:cs="Calibri"/>
-        </w:rPr>
-        <w:t>asdtiansfjoaen</w:t>
-      </w:r>
-      <w:proofErr w:type="spellEnd"/>
-    </w:p>
-    <w:p>
-      <w:pPr>
-        <w:jc w:val="both"/>
-        <w:rPr>
-          <w:rFonts w:cs="Calibri"/>
-        </w:rPr>
-      </w:pPr>
-      <w:proofErr w:type="spellStart"/>
-      <w:r>
-        <w:rPr>
-          <w:rFonts w:cs="Calibri"/>
-        </w:rPr>
-        <w:t>asddf</w:t>
-      </w:r>
-      <w:proofErr w:type="spellEnd"/>
-    </w:p>
-    <w:p>
-      <w:pPr>
-        <w:jc w:val="both"/>
-        <w:rPr>
-          <w:rFonts w:cs="Calibri"/>
-        </w:rPr>
-      </w:pPr>
-    </w:p>
-    <w:p>
-      <w:pPr>
-        <w:jc w:val="both"/>
-        <w:rPr>
-          <w:rFonts w:cs="Calibri"/>
-        </w:rPr>
-      </w:pPr>
-    </w:p>
-    <w:p>
-      <w:pPr>
-        <w:jc w:val="both"/>
-        <w:rPr>
-          <w:rFonts w:cs="Calibri"/>
-        </w:rPr>
-      </w:pPr>
-      <w:proofErr w:type="spellStart"/>
-      <w:r>
-        <w:rPr>
-          <w:rFonts w:cs="Calibri"/>
-        </w:rPr>
-        <w:t>asdsa</w:t>
-      </w:r>
-      <w:proofErr w:type="spellEnd"/>
-    </w:p>
-    <w:p>
-      <w:pPr>
-        <w:jc w:val="both"/>
-        <w:rPr>
-          <w:rFonts w:cs="Calibri"/>
-        </w:rPr>
-      </w:pPr>
-      <w:r>
-        <w:rPr>
-          <w:rFonts w:cs="Calibri"/>
-        </w:rPr>
-        <w:t>f</w:t>
-      </w:r>
-    </w:p>
-    <w:p>
-      <w:pPr>
-        <w:jc w:val="both"/>
-        <w:rPr>
-          <w:rFonts w:cs="Calibri"/>
-        </w:rPr>
-      </w:pPr>
-      <w:proofErr w:type="spellStart"/>
-      <w:r>
-        <w:rPr>
-          <w:rFonts w:cs="Calibri"/>
-        </w:rPr>
-        <w:t>saf</w:t>
-      </w:r>
-      <w:proofErr w:type="spellEnd"/>
-    </w:p>
-    <w:p>
-      <w:pPr>
-        <w:jc w:val="both"/>
-        <w:rPr>
-          <w:rFonts w:cs="Calibri"/>
-        </w:rPr>
-      </w:pPr>
-      <w:proofErr w:type="spellStart"/>
-      <w:r>
-        <w:rPr>
-          <w:rFonts w:cs="Calibri"/>
-        </w:rPr>
-        <w:t>as</w:t>
-      </w:r>
-      <w:proofErr w:type="spellEnd"/>
-    </w:p>
-    <w:p>
-      <w:pPr>
-        <w:jc w:val="both"/>
-        <w:rPr>
-          <w:rFonts w:cs="Calibri"/>
-        </w:rPr>
-      </w:pPr>
-      <w:r>
-        <w:rPr>
-          <w:rFonts w:cs="Calibri"/>
-        </w:rPr>
-        <w:t>f</w:t>
-      </w:r>
-    </w:p>
-    <w:p>
-      <w:pPr>
-        <w:jc w:val="both"/>
-        <w:rPr>
-          <w:rFonts w:cs="Calibri"/>
-        </w:rPr>
-      </w:pPr>
-      <w:r>
-        <w:rPr>
-          <w:rFonts w:cs="Calibri"/>
-        </w:rPr>
-        <w:t>sa</w:t>
-      </w:r>
-    </w:p>
-    <w:p>
-      <w:pPr>
-        <w:jc w:val="both"/>
-        <w:rPr>
-          <w:rFonts w:cs="Calibri"/>
-        </w:rPr>
-      </w:pPr>
-      <w:proofErr w:type="spellStart"/>
-      <w:r>
-        <w:rPr>
-          <w:rFonts w:cs="Calibri"/>
-        </w:rPr>
-        <w:t>fs</w:t>
-      </w:r>
-      <w:proofErr w:type="spellEnd"/>
-    </w:p>
-    <w:p>
-      <w:pPr>
-        <w:jc w:val="both"/>
-        <w:rPr>
-          <w:rFonts w:cs="Calibri"/>
-        </w:rPr>
-      </w:pPr>
-      <w:proofErr w:type="spellStart"/>
-      <w:r>
-        <w:rPr>
-          <w:rFonts w:cs="Calibri"/>
-        </w:rPr>
-        <w:t>afas</w:t>
-      </w:r>
-      <w:proofErr w:type="spellEnd"/>
-    </w:p>
-    <w:p>
-      <w:pPr>
-        <w:jc w:val="both"/>
-        <w:rPr>
-          <w:rFonts w:cs="Calibri"/>
-        </w:rPr>
-      </w:pPr>
-      <w:r>
-        <w:rPr>
-          <w:rFonts w:cs="Calibri"/>
-        </w:rPr>
-        <w:br w:type="page"/>
+      <w:r>
+        <w:rPr>
+          <w:rFonts w:cs="Calibri"/>
+        </w:rPr>
+        <w:t xml:space="preserve">Nel progetto vengono utilizzati </w:t>
+      </w:r>
+      <w:r>
+        <w:rPr>
+          <w:rFonts w:cs="Calibri"/>
+        </w:rPr>
+        <w:t>due</w:t>
+      </w:r>
+      <w:r>
+        <w:rPr>
+          <w:rFonts w:cs="Calibri"/>
+        </w:rPr>
+        <w:t xml:space="preserve"> tipi di file</w:t>
+      </w:r>
+      <w:r>
+        <w:rPr>
+          <w:rFonts w:cs="Calibri"/>
+        </w:rPr>
+        <w:t xml:space="preserve">, reperibili nella </w:t>
+      </w:r>
+      <w:proofErr w:type="gramStart"/>
+      <w:r>
+        <w:rPr>
+          <w:rFonts w:cs="Calibri"/>
+        </w:rPr>
+        <w:t xml:space="preserve">directory  </w:t>
+      </w:r>
+      <w:r>
+        <w:rPr>
+          <w:rFonts w:ascii="Courier New" w:hAnsi="Courier New" w:cs="Courier New"/>
+          <w:highlight w:val="lightGray"/>
+        </w:rPr>
+        <w:t>data</w:t>
+      </w:r>
+      <w:proofErr w:type="gramEnd"/>
+      <w:r>
+        <w:rPr>
+          <w:rFonts w:cs="Calibri"/>
+        </w:rPr>
+        <w:t>:</w:t>
+      </w:r>
+    </w:p>
+    <w:p>
+      <w:pPr>
+        <w:pStyle w:val="Paragrafoelenco"/>
+        <w:numPr>
+          <w:ilvl w:val="0"/>
+          <w:numId w:val="9"/>
+        </w:numPr>
+        <w:jc w:val="both"/>
+        <w:rPr>
+          <w:rFonts w:cs="Calibri"/>
+        </w:rPr>
+      </w:pPr>
+      <w:r>
+        <w:rPr>
+          <w:rFonts w:cs="Calibri"/>
+          <w:b/>
+          <w:bCs/>
+          <w:i/>
+          <w:iCs/>
+        </w:rPr>
+        <w:t>config_timeout.conf</w:t>
+      </w:r>
+      <w:r>
+        <w:rPr>
+          <w:rFonts w:cs="Calibri"/>
+        </w:rPr>
+        <w:t xml:space="preserve"> </w:t>
+      </w:r>
+      <w:r>
+        <w:rPr>
+          <w:rFonts w:cs="Calibri"/>
+        </w:rPr>
+        <w:sym w:font="Wingdings" w:char="F0E0"/>
+      </w:r>
+      <w:r>
+        <w:rPr>
+          <w:rFonts w:cs="Calibri"/>
+        </w:rPr>
+        <w:t xml:space="preserve"> contiene valori utilizzati per terminare la simulazione correttamente</w:t>
+      </w:r>
+    </w:p>
+    <w:p>
+      <w:pPr>
+        <w:pStyle w:val="Paragrafoelenco"/>
+        <w:numPr>
+          <w:ilvl w:val="0"/>
+          <w:numId w:val="9"/>
+        </w:numPr>
+        <w:jc w:val="both"/>
+        <w:rPr>
+          <w:rFonts w:cs="Calibri"/>
+        </w:rPr>
+      </w:pPr>
+      <w:r>
+        <w:rPr>
+          <w:rFonts w:cs="Calibri"/>
+          <w:b/>
+          <w:bCs/>
+          <w:i/>
+          <w:iCs/>
+        </w:rPr>
+        <w:t>config_explode.conf</w:t>
+      </w:r>
+      <w:r>
+        <w:rPr>
+          <w:rFonts w:cs="Calibri"/>
+        </w:rPr>
+        <w:t xml:space="preserve"> </w:t>
+      </w:r>
+      <w:r>
+        <w:rPr>
+          <w:rFonts w:cs="Calibri"/>
+        </w:rPr>
+        <w:sym w:font="Wingdings" w:char="F0E0"/>
+      </w:r>
+      <w:r>
+        <w:rPr>
+          <w:rFonts w:cs="Calibri"/>
+        </w:rPr>
+        <w:t xml:space="preserve"> contiene valori che interrompono la simulazione in maniera prematura, ovvero esplode se </w:t>
+      </w:r>
+      <w:r>
+        <w:rPr>
+          <w:rFonts w:cs="Calibri"/>
+        </w:rPr>
+        <w:t>il numero degli utenti in attesa a fine giornata è maggiore di EXPLODE_THRESHOLD</w:t>
+      </w:r>
+    </w:p>
+    <w:p>
+      <w:pPr>
+        <w:jc w:val="both"/>
+        <w:rPr>
+          <w:rFonts w:cs="Calibri"/>
+        </w:rPr>
+      </w:pPr>
+      <w:r>
+        <w:rPr>
+          <w:rFonts w:cs="Calibri"/>
+        </w:rPr>
+        <w:t xml:space="preserve">Queste configurazioni devono essere copiate e incollate all’interno di </w:t>
+      </w:r>
+      <w:r>
+        <w:rPr>
+          <w:rFonts w:ascii="Courier New" w:hAnsi="Courier New" w:cs="Courier New"/>
+          <w:highlight w:val="lightGray"/>
+        </w:rPr>
+        <w:t>post_office.conf</w:t>
+      </w:r>
+      <w:r>
+        <w:rPr>
+          <w:rFonts w:cs="Calibri"/>
+        </w:rPr>
+        <w:t>, file di configurazione principale che viene utilizzato da direttore per salvarsi i seguenti valori:</w:t>
+      </w:r>
+    </w:p>
+    <w:p>
+      <w:pPr>
+        <w:pStyle w:val="Paragrafoelenco"/>
+        <w:numPr>
+          <w:ilvl w:val="0"/>
+          <w:numId w:val="11"/>
+        </w:numPr>
+        <w:jc w:val="both"/>
+        <w:rPr>
+          <w:rFonts w:cs="Calibri"/>
+        </w:rPr>
+      </w:pPr>
+      <w:r>
+        <w:rPr>
+          <w:rFonts w:cs="Calibri"/>
+          <w:b/>
+          <w:bCs/>
+        </w:rPr>
+        <w:t>NOF_WORKER_SEATS</w:t>
+      </w:r>
+      <w:r>
+        <w:rPr>
+          <w:rFonts w:cs="Calibri"/>
+        </w:rPr>
+        <w:t xml:space="preserve"> </w:t>
+      </w:r>
+      <w:r>
+        <w:rPr>
+          <w:rFonts w:cs="Calibri"/>
+        </w:rPr>
+        <w:sym w:font="Wingdings" w:char="F0E0"/>
+      </w:r>
+      <w:r>
+        <w:rPr>
+          <w:rFonts w:cs="Calibri"/>
+        </w:rPr>
+        <w:t xml:space="preserve"> numero di postazioni disponibili</w:t>
+      </w:r>
+    </w:p>
+    <w:p>
+      <w:pPr>
+        <w:pStyle w:val="Paragrafoelenco"/>
+        <w:numPr>
+          <w:ilvl w:val="0"/>
+          <w:numId w:val="11"/>
+        </w:numPr>
+        <w:jc w:val="both"/>
+        <w:rPr>
+          <w:rFonts w:cs="Calibri"/>
+        </w:rPr>
+      </w:pPr>
+      <w:r>
+        <w:rPr>
+          <w:rFonts w:cs="Calibri"/>
+          <w:b/>
+          <w:bCs/>
+        </w:rPr>
+        <w:t>NOF_WORKERS</w:t>
+      </w:r>
+      <w:r>
+        <w:rPr>
+          <w:rFonts w:cs="Calibri"/>
+        </w:rPr>
+        <w:t xml:space="preserve"> </w:t>
+      </w:r>
+      <w:r>
+        <w:rPr>
+          <w:rFonts w:cs="Calibri"/>
+        </w:rPr>
+        <w:sym w:font="Wingdings" w:char="F0E0"/>
+      </w:r>
+      <w:r>
+        <w:rPr>
+          <w:rFonts w:cs="Calibri"/>
+        </w:rPr>
+        <w:t xml:space="preserve"> numero totale di lavoratori</w:t>
+      </w:r>
+    </w:p>
+    <w:p>
+      <w:pPr>
+        <w:pStyle w:val="Paragrafoelenco"/>
+        <w:numPr>
+          <w:ilvl w:val="0"/>
+          <w:numId w:val="11"/>
+        </w:numPr>
+        <w:jc w:val="both"/>
+        <w:rPr>
+          <w:rFonts w:cs="Calibri"/>
+        </w:rPr>
+      </w:pPr>
+      <w:r>
+        <w:rPr>
+          <w:rFonts w:cs="Calibri"/>
+          <w:b/>
+          <w:bCs/>
+        </w:rPr>
+        <w:t>NOF_USERS</w:t>
+      </w:r>
+      <w:r>
+        <w:rPr>
+          <w:rFonts w:cs="Calibri"/>
+        </w:rPr>
+        <w:t xml:space="preserve"> </w:t>
+      </w:r>
+      <w:r>
+        <w:rPr>
+          <w:rFonts w:cs="Calibri"/>
+        </w:rPr>
+        <w:sym w:font="Wingdings" w:char="F0E0"/>
+      </w:r>
+      <w:r>
+        <w:rPr>
+          <w:rFonts w:cs="Calibri"/>
+        </w:rPr>
+        <w:t xml:space="preserve"> numero totale di utenti </w:t>
+      </w:r>
+    </w:p>
+    <w:p>
+      <w:pPr>
+        <w:pStyle w:val="Paragrafoelenco"/>
+        <w:numPr>
+          <w:ilvl w:val="0"/>
+          <w:numId w:val="11"/>
+        </w:numPr>
+        <w:jc w:val="both"/>
+        <w:rPr>
+          <w:rFonts w:cs="Calibri"/>
+        </w:rPr>
+      </w:pPr>
+      <w:r>
+        <w:rPr>
+          <w:rFonts w:cs="Calibri"/>
+          <w:b/>
+          <w:bCs/>
+        </w:rPr>
+        <w:t>SIM_DURATION</w:t>
+      </w:r>
+      <w:r>
+        <w:rPr>
+          <w:rFonts w:cs="Calibri"/>
+        </w:rPr>
+        <w:t xml:space="preserve"> </w:t>
+      </w:r>
+      <w:r>
+        <w:rPr>
+          <w:rFonts w:cs="Calibri"/>
+        </w:rPr>
+        <w:sym w:font="Wingdings" w:char="F0E0"/>
+      </w:r>
+      <w:r>
+        <w:rPr>
+          <w:rFonts w:cs="Calibri"/>
+        </w:rPr>
+        <w:t xml:space="preserve"> durata complessiva della simulazione, ovvero i giorni lavorativi</w:t>
+      </w:r>
+    </w:p>
+    <w:p>
+      <w:pPr>
+        <w:pStyle w:val="Paragrafoelenco"/>
+        <w:numPr>
+          <w:ilvl w:val="0"/>
+          <w:numId w:val="11"/>
+        </w:numPr>
+        <w:jc w:val="both"/>
+        <w:rPr>
+          <w:rFonts w:cs="Calibri"/>
+        </w:rPr>
+      </w:pPr>
+      <w:r>
+        <w:rPr>
+          <w:rFonts w:cs="Calibri"/>
+          <w:b/>
+          <w:bCs/>
+        </w:rPr>
+        <w:t>N_NANO_SECS</w:t>
+      </w:r>
+      <w:r>
+        <w:rPr>
+          <w:rFonts w:cs="Calibri"/>
+        </w:rPr>
+        <w:t xml:space="preserve"> </w:t>
+      </w:r>
+      <w:r>
+        <w:rPr>
+          <w:rFonts w:cs="Calibri"/>
+        </w:rPr>
+        <w:sym w:font="Wingdings" w:char="F0E0"/>
+      </w:r>
+      <w:r>
+        <w:rPr>
+          <w:rFonts w:cs="Calibri"/>
+        </w:rPr>
+        <w:t xml:space="preserve"> tempo a disposizione per la simulazione in nanosecondi</w:t>
+      </w:r>
+    </w:p>
+    <w:p>
+      <w:pPr>
+        <w:pStyle w:val="Paragrafoelenco"/>
+        <w:numPr>
+          <w:ilvl w:val="0"/>
+          <w:numId w:val="11"/>
+        </w:numPr>
+        <w:jc w:val="both"/>
+        <w:rPr>
+          <w:rFonts w:cs="Calibri"/>
+        </w:rPr>
+      </w:pPr>
+      <w:r>
+        <w:rPr>
+          <w:rFonts w:cs="Calibri"/>
+          <w:b/>
+          <w:bCs/>
+        </w:rPr>
+        <w:t>P_SERV_MIN</w:t>
+      </w:r>
+      <w:r>
+        <w:rPr>
+          <w:rFonts w:cs="Calibri"/>
+        </w:rPr>
+        <w:t xml:space="preserve"> </w:t>
+      </w:r>
+      <w:r>
+        <w:rPr>
+          <w:rFonts w:cs="Calibri"/>
+        </w:rPr>
+        <w:sym w:font="Wingdings" w:char="F0E0"/>
+      </w:r>
+      <w:r>
+        <w:rPr>
+          <w:rFonts w:cs="Calibri"/>
+        </w:rPr>
+        <w:t xml:space="preserve"> percentuale minima assegnata ad un servizio</w:t>
+      </w:r>
+    </w:p>
+    <w:p>
+      <w:pPr>
+        <w:pStyle w:val="Paragrafoelenco"/>
+        <w:numPr>
+          <w:ilvl w:val="0"/>
+          <w:numId w:val="11"/>
+        </w:numPr>
+        <w:jc w:val="both"/>
+        <w:rPr>
+          <w:rFonts w:cs="Calibri"/>
+        </w:rPr>
+      </w:pPr>
+      <w:r>
+        <w:rPr>
+          <w:rFonts w:cs="Calibri"/>
+          <w:b/>
+          <w:bCs/>
+        </w:rPr>
+        <w:t>P_SERV_MAX</w:t>
+      </w:r>
+      <w:r>
+        <w:rPr>
+          <w:rFonts w:cs="Calibri"/>
+        </w:rPr>
+        <w:t xml:space="preserve"> </w:t>
+      </w:r>
+      <w:r>
+        <w:rPr>
+          <w:rFonts w:cs="Calibri"/>
+        </w:rPr>
+        <w:sym w:font="Wingdings" w:char="F0E0"/>
+      </w:r>
+      <w:r>
+        <w:rPr>
+          <w:rFonts w:cs="Calibri"/>
+        </w:rPr>
+        <w:t xml:space="preserve">  </w:t>
+      </w:r>
+      <w:r>
+        <w:rPr>
+          <w:rFonts w:cs="Calibri"/>
+        </w:rPr>
+        <w:t xml:space="preserve">percentuale </w:t>
+      </w:r>
+      <w:r>
+        <w:rPr>
+          <w:rFonts w:cs="Calibri"/>
+        </w:rPr>
+        <w:t>massima</w:t>
+      </w:r>
+      <w:r>
+        <w:rPr>
+          <w:rFonts w:cs="Calibri"/>
+        </w:rPr>
+        <w:t xml:space="preserve"> assegnata ad un servizio</w:t>
+      </w:r>
+    </w:p>
+    <w:p>
+      <w:pPr>
+        <w:pStyle w:val="Paragrafoelenco"/>
+        <w:numPr>
+          <w:ilvl w:val="0"/>
+          <w:numId w:val="11"/>
+        </w:numPr>
+        <w:jc w:val="both"/>
+        <w:rPr>
+          <w:rFonts w:cs="Calibri"/>
+        </w:rPr>
+      </w:pPr>
+      <w:r>
+        <w:rPr>
+          <w:rFonts w:cs="Calibri"/>
+          <w:b/>
+          <w:bCs/>
+        </w:rPr>
+        <w:t>P_PAUSE</w:t>
+      </w:r>
+      <w:r>
+        <w:rPr>
+          <w:rFonts w:cs="Calibri"/>
+        </w:rPr>
+        <w:t xml:space="preserve"> </w:t>
+      </w:r>
+      <w:r>
+        <w:rPr>
+          <w:rFonts w:cs="Calibri"/>
+        </w:rPr>
+        <w:sym w:font="Wingdings" w:char="F0E0"/>
+      </w:r>
+      <w:r>
+        <w:rPr>
+          <w:rFonts w:cs="Calibri"/>
+        </w:rPr>
+        <w:t xml:space="preserve"> percentuale di un operatore che va in pausa</w:t>
+      </w:r>
+    </w:p>
+    <w:p>
+      <w:pPr>
+        <w:pStyle w:val="Paragrafoelenco"/>
+        <w:numPr>
+          <w:ilvl w:val="0"/>
+          <w:numId w:val="11"/>
+        </w:numPr>
+        <w:jc w:val="both"/>
+        <w:rPr>
+          <w:rFonts w:cs="Calibri"/>
+        </w:rPr>
+      </w:pPr>
+      <w:r>
+        <w:rPr>
+          <w:rFonts w:cs="Calibri"/>
+          <w:b/>
+          <w:bCs/>
+        </w:rPr>
+        <w:t>NOF_PAUSE</w:t>
+      </w:r>
+      <w:r>
+        <w:rPr>
+          <w:rFonts w:cs="Calibri"/>
+        </w:rPr>
+        <w:t xml:space="preserve"> </w:t>
+      </w:r>
+      <w:r>
+        <w:rPr>
+          <w:rFonts w:cs="Calibri"/>
+        </w:rPr>
+        <w:sym w:font="Wingdings" w:char="F0E0"/>
+      </w:r>
+      <w:r>
+        <w:rPr>
+          <w:rFonts w:cs="Calibri"/>
+        </w:rPr>
+        <w:t xml:space="preserve"> numero di pause concesse a ciascun lavoratore</w:t>
+      </w:r>
+    </w:p>
+    <w:p>
+      <w:pPr>
+        <w:pStyle w:val="Paragrafoelenco"/>
+        <w:numPr>
+          <w:ilvl w:val="0"/>
+          <w:numId w:val="11"/>
+        </w:numPr>
+        <w:jc w:val="both"/>
+        <w:rPr>
+          <w:rFonts w:cs="Calibri"/>
+        </w:rPr>
+      </w:pPr>
+      <w:r>
+        <w:rPr>
+          <w:rFonts w:cs="Calibri"/>
+          <w:b/>
+          <w:bCs/>
+        </w:rPr>
+        <w:t>EXPLODE_THRESHOLD</w:t>
+      </w:r>
+      <w:r>
+        <w:rPr>
+          <w:rFonts w:cs="Calibri"/>
+        </w:rPr>
+        <w:t xml:space="preserve"> </w:t>
+      </w:r>
+      <w:r>
+        <w:rPr>
+          <w:rFonts w:cs="Calibri"/>
+        </w:rPr>
+        <w:sym w:font="Wingdings" w:char="F0E0"/>
+      </w:r>
+      <w:r>
+        <w:rPr>
+          <w:rFonts w:cs="Calibri"/>
+        </w:rPr>
+        <w:t xml:space="preserve"> soglia minima di utenti in coda per attivare l’esplosione della simulazione</w:t>
+      </w:r>
+    </w:p>
+    <w:p>
+      <w:pPr>
+        <w:jc w:val="both"/>
+        <w:rPr>
+          <w:rFonts w:cs="Calibri"/>
+        </w:rPr>
+      </w:pPr>
+    </w:p>
+    <w:p>
+      <w:pPr>
+        <w:jc w:val="both"/>
+        <w:rPr>
+          <w:rFonts w:cs="Calibri"/>
+        </w:rPr>
+      </w:pPr>
+      <w:r>
+        <w:rPr>
+          <w:rFonts w:cs="Calibri"/>
+        </w:rPr>
+        <w:t xml:space="preserve">Nella directory </w:t>
+      </w:r>
+      <w:r>
+        <w:rPr>
+          <w:rFonts w:ascii="Courier New" w:hAnsi="Courier New" w:cs="Courier New"/>
+          <w:highlight w:val="lightGray"/>
+        </w:rPr>
+        <w:t>include</w:t>
+      </w:r>
+      <w:r>
+        <w:rPr>
+          <w:rFonts w:cs="Calibri"/>
+        </w:rPr>
+        <w:t xml:space="preserve"> invece abbiamo creato due file .h (</w:t>
+      </w:r>
+      <w:r>
+        <w:rPr>
+          <w:rFonts w:ascii="Courier New" w:hAnsi="Courier New" w:cs="Courier New"/>
+          <w:highlight w:val="lightGray"/>
+        </w:rPr>
+        <w:t>config.h</w:t>
+      </w:r>
+      <w:r>
+        <w:rPr>
+          <w:rFonts w:cs="Calibri"/>
+        </w:rPr>
+        <w:t xml:space="preserve"> e </w:t>
+      </w:r>
+      <w:r>
+        <w:rPr>
+          <w:rFonts w:ascii="Courier New" w:hAnsi="Courier New" w:cs="Courier New"/>
+          <w:highlight w:val="lightGray"/>
+        </w:rPr>
+        <w:t>function</w:t>
+      </w:r>
+      <w:r>
+        <w:rPr>
+          <w:rFonts w:ascii="Courier New" w:hAnsi="Courier New" w:cs="Courier New"/>
+          <w:highlight w:val="lightGray"/>
+        </w:rPr>
+        <w:t>s</w:t>
+      </w:r>
+      <w:r>
+        <w:rPr>
+          <w:rFonts w:ascii="Courier New" w:hAnsi="Courier New" w:cs="Courier New"/>
+          <w:highlight w:val="lightGray"/>
+        </w:rPr>
+        <w:t>.h</w:t>
+      </w:r>
+      <w:r>
+        <w:rPr>
+          <w:rFonts w:cs="Calibri"/>
+        </w:rPr>
+        <w:t>) che contengono rispettivamente:</w:t>
+      </w:r>
+    </w:p>
+    <w:p>
+      <w:pPr>
+        <w:pStyle w:val="Paragrafoelenco"/>
+        <w:numPr>
+          <w:ilvl w:val="0"/>
+          <w:numId w:val="12"/>
+        </w:numPr>
+        <w:jc w:val="both"/>
+        <w:rPr>
+          <w:rFonts w:cs="Calibri"/>
+        </w:rPr>
+      </w:pPr>
+      <w:r>
+        <w:rPr>
+          <w:rFonts w:ascii="Courier New" w:hAnsi="Courier New" w:cs="Courier New"/>
+          <w:b/>
+          <w:bCs/>
+          <w:sz w:val="28"/>
+          <w:szCs w:val="28"/>
+        </w:rPr>
+        <w:t>config.h</w:t>
+      </w:r>
+    </w:p>
+    <w:p>
+      <w:pPr>
+        <w:pStyle w:val="Paragrafoelenco"/>
+        <w:numPr>
+          <w:ilvl w:val="0"/>
+          <w:numId w:val="10"/>
+        </w:numPr>
+        <w:jc w:val="both"/>
+        <w:rPr>
+          <w:rFonts w:cs="Calibri"/>
+        </w:rPr>
+      </w:pPr>
+      <w:r>
+        <w:rPr>
+          <w:rFonts w:cs="Calibri"/>
+          <w:b/>
+          <w:bCs/>
+        </w:rPr>
+        <w:t>MAX_SPORTELLI</w:t>
+      </w:r>
+      <w:r>
+        <w:rPr>
+          <w:rFonts w:cs="Calibri"/>
+        </w:rPr>
+        <w:t xml:space="preserve"> </w:t>
+      </w:r>
+      <w:r>
+        <w:rPr>
+          <w:rFonts w:cs="Calibri"/>
+        </w:rPr>
+        <w:sym w:font="Wingdings" w:char="F0E0"/>
+      </w:r>
+      <w:r>
+        <w:rPr>
+          <w:rFonts w:cs="Calibri"/>
+        </w:rPr>
+        <w:t xml:space="preserve"> numero massimo di sportelli disponibili nel sistema</w:t>
+      </w:r>
+    </w:p>
+    <w:p>
+      <w:pPr>
+        <w:pStyle w:val="Paragrafoelenco"/>
+        <w:numPr>
+          <w:ilvl w:val="0"/>
+          <w:numId w:val="10"/>
+        </w:numPr>
+        <w:jc w:val="both"/>
+        <w:rPr>
+          <w:rFonts w:cs="Calibri"/>
+        </w:rPr>
+      </w:pPr>
+      <w:r>
+        <w:rPr>
+          <w:rFonts w:cs="Calibri"/>
+          <w:b/>
+          <w:bCs/>
+        </w:rPr>
+        <w:t>MAX_LAVORATORI</w:t>
+      </w:r>
+      <w:r>
+        <w:rPr>
+          <w:rFonts w:cs="Calibri"/>
+        </w:rPr>
+        <w:t xml:space="preserve"> </w:t>
+      </w:r>
+      <w:r>
+        <w:rPr>
+          <w:rFonts w:cs="Calibri"/>
+        </w:rPr>
+        <w:sym w:font="Wingdings" w:char="F0E0"/>
+      </w:r>
+      <w:r>
+        <w:rPr>
+          <w:rFonts w:cs="Calibri"/>
+        </w:rPr>
+        <w:t xml:space="preserve"> numero massimo di lavoratori disponibili nel sistema</w:t>
+      </w:r>
+    </w:p>
+    <w:p>
+      <w:pPr>
+        <w:pStyle w:val="Paragrafoelenco"/>
+        <w:numPr>
+          <w:ilvl w:val="0"/>
+          <w:numId w:val="10"/>
+        </w:numPr>
+        <w:jc w:val="both"/>
+        <w:rPr>
+          <w:rFonts w:cs="Calibri"/>
+        </w:rPr>
+      </w:pPr>
+      <w:r>
+        <w:rPr>
+          <w:rFonts w:cs="Calibri"/>
+          <w:b/>
+          <w:bCs/>
+        </w:rPr>
+        <w:t>NUM_SERVIZI</w:t>
+      </w:r>
+      <w:r>
+        <w:rPr>
+          <w:rFonts w:cs="Calibri"/>
+        </w:rPr>
+        <w:t xml:space="preserve"> </w:t>
+      </w:r>
+      <w:r>
+        <w:rPr>
+          <w:rFonts w:cs="Calibri"/>
+        </w:rPr>
+        <w:sym w:font="Wingdings" w:char="F0E0"/>
+      </w:r>
+      <w:r>
+        <w:rPr>
+          <w:rFonts w:cs="Calibri"/>
+        </w:rPr>
+        <w:t xml:space="preserve"> numero totale dei servizi offerti</w:t>
+      </w:r>
+    </w:p>
+    <w:p>
+      <w:pPr>
+        <w:pStyle w:val="Paragrafoelenco"/>
+        <w:numPr>
+          <w:ilvl w:val="0"/>
+          <w:numId w:val="10"/>
+        </w:numPr>
+        <w:jc w:val="both"/>
+        <w:rPr>
+          <w:rFonts w:cs="Calibri"/>
+        </w:rPr>
+      </w:pPr>
+      <w:r>
+        <w:rPr>
+          <w:rFonts w:cs="Calibri"/>
+          <w:b/>
+          <w:bCs/>
+        </w:rPr>
+        <w:t xml:space="preserve">tempario[NUM_SERVIZI] </w:t>
+      </w:r>
+      <w:r>
+        <w:rPr>
+          <w:rFonts w:cs="Calibri"/>
+        </w:rPr>
+        <w:sym w:font="Wingdings" w:char="F0E0"/>
+      </w:r>
+      <w:r>
+        <w:rPr>
+          <w:rFonts w:cs="Calibri"/>
+        </w:rPr>
+        <w:t xml:space="preserve"> tempi di erogazione dei servizi</w:t>
+      </w:r>
+    </w:p>
+    <w:p>
+      <w:pPr>
+        <w:pStyle w:val="Paragrafoelenco"/>
+        <w:ind w:left="1425"/>
+        <w:jc w:val="both"/>
+        <w:rPr>
+          <w:rFonts w:cs="Calibri"/>
+        </w:rPr>
+      </w:pPr>
+    </w:p>
+    <w:p>
+      <w:pPr>
+        <w:pStyle w:val="Paragrafoelenco"/>
+        <w:numPr>
+          <w:ilvl w:val="0"/>
+          <w:numId w:val="10"/>
+        </w:numPr>
+        <w:jc w:val="both"/>
+        <w:rPr>
+          <w:rFonts w:cs="Calibri"/>
+        </w:rPr>
+      </w:pPr>
+      <w:r>
+        <w:rPr>
+          <w:rFonts w:cs="Calibri"/>
+          <w:b/>
+          <w:bCs/>
+        </w:rPr>
+        <w:t>Config</w:t>
+      </w:r>
+      <w:r>
+        <w:rPr>
+          <w:rFonts w:cs="Calibri"/>
+        </w:rPr>
+        <w:t xml:space="preserve"> </w:t>
+      </w:r>
+      <w:r>
+        <w:rPr>
+          <w:rFonts w:cs="Calibri"/>
+        </w:rPr>
+        <w:sym w:font="Wingdings" w:char="F0E0"/>
+      </w:r>
+      <w:r>
+        <w:rPr>
+          <w:rFonts w:cs="Calibri"/>
+        </w:rPr>
+        <w:t xml:space="preserve"> struttura in cui </w:t>
+      </w:r>
+      <w:r>
+        <w:rPr>
+          <w:rFonts w:cs="Calibri"/>
+        </w:rPr>
+        <w:t>vengono salvati tutti i valori di post_office.conf, inclusi altri valori impostati nel direttore:</w:t>
+      </w:r>
+    </w:p>
+    <w:p>
+      <w:pPr>
+        <w:pStyle w:val="Paragrafoelenco"/>
+        <w:numPr>
+          <w:ilvl w:val="1"/>
+          <w:numId w:val="10"/>
+        </w:numPr>
+        <w:jc w:val="both"/>
+        <w:rPr>
+          <w:rFonts w:cs="Calibri"/>
+        </w:rPr>
+      </w:pPr>
+      <w:r>
+        <w:rPr>
+          <w:rFonts w:cs="Calibri"/>
+          <w:b/>
+          <w:bCs/>
+        </w:rPr>
+        <w:t xml:space="preserve">DAYS_LEFT </w:t>
+      </w:r>
+      <w:r>
+        <w:rPr>
+          <w:rFonts w:cs="Calibri"/>
+        </w:rPr>
+        <w:sym w:font="Wingdings" w:char="F0E0"/>
+      </w:r>
+      <w:r>
+        <w:rPr>
+          <w:rFonts w:cs="Calibri"/>
+        </w:rPr>
+        <w:t xml:space="preserve"> giorni rimanenti alla fine della simulazione</w:t>
+      </w:r>
+    </w:p>
+    <w:p>
+      <w:pPr>
+        <w:pStyle w:val="Paragrafoelenco"/>
+        <w:numPr>
+          <w:ilvl w:val="1"/>
+          <w:numId w:val="10"/>
+        </w:numPr>
+        <w:jc w:val="both"/>
+        <w:rPr>
+          <w:rFonts w:cs="Calibri"/>
+        </w:rPr>
+      </w:pPr>
+      <w:r>
+        <w:rPr>
+          <w:rFonts w:cs="Calibri"/>
+          <w:b/>
+          <w:bCs/>
+        </w:rPr>
+        <w:t xml:space="preserve">sportelli[MAX_SPORTELLI] </w:t>
+      </w:r>
+      <w:r>
+        <w:rPr>
+          <w:rFonts w:cs="Calibri"/>
+        </w:rPr>
+        <w:sym w:font="Wingdings" w:char="F0E0"/>
+      </w:r>
+      <w:r>
+        <w:rPr>
+          <w:rFonts w:cs="Calibri"/>
+        </w:rPr>
+        <w:t xml:space="preserve"> c</w:t>
+      </w:r>
+      <w:r>
+        <w:rPr>
+          <w:rFonts w:cs="Calibri"/>
+        </w:rPr>
+        <w:t>onfigurazione degli sportelli per tipo di servizio.</w:t>
+      </w:r>
+    </w:p>
+    <w:p>
+      <w:pPr>
+        <w:pStyle w:val="Paragrafoelenco"/>
+        <w:numPr>
+          <w:ilvl w:val="1"/>
+          <w:numId w:val="10"/>
+        </w:numPr>
+        <w:jc w:val="both"/>
+        <w:rPr>
+          <w:rFonts w:cs="Calibri"/>
+        </w:rPr>
+      </w:pPr>
+      <w:r>
+        <w:rPr>
+          <w:rFonts w:cs="Calibri"/>
+          <w:b/>
+          <w:bCs/>
+        </w:rPr>
+        <w:t>lavoratori[</w:t>
+      </w:r>
+      <w:r>
+        <w:rPr>
+          <w:rFonts w:cs="Calibri"/>
+          <w:b/>
+          <w:bCs/>
+        </w:rPr>
+        <w:t>MAX_LAVORATORI</w:t>
+      </w:r>
+      <w:r>
+        <w:rPr>
+          <w:rFonts w:cs="Calibri"/>
+          <w:b/>
+          <w:bCs/>
+        </w:rPr>
+        <w:t>]</w:t>
+      </w:r>
+      <w:r>
+        <w:rPr>
+          <w:rFonts w:cs="Calibri"/>
+        </w:rPr>
+        <w:t xml:space="preserve"> </w:t>
+      </w:r>
+      <w:r>
+        <w:rPr>
+          <w:rFonts w:cs="Calibri"/>
+        </w:rPr>
+        <w:sym w:font="Wingdings" w:char="F0E0"/>
+      </w:r>
+      <w:r>
+        <w:rPr>
+          <w:rFonts w:cs="Calibri"/>
+        </w:rPr>
+        <w:t xml:space="preserve"> m</w:t>
+      </w:r>
+      <w:r>
+        <w:rPr>
+          <w:rFonts w:cs="Calibri"/>
+        </w:rPr>
+        <w:t>appatura dei lavoratori e dei loro servizi.</w:t>
+      </w:r>
+    </w:p>
+    <w:p>
+      <w:pPr>
+        <w:pStyle w:val="Paragrafoelenco"/>
+        <w:ind w:left="1425"/>
+        <w:jc w:val="both"/>
+        <w:rPr>
+          <w:rFonts w:cs="Calibri"/>
+        </w:rPr>
+      </w:pPr>
+    </w:p>
+    <w:p>
+      <w:pPr>
+        <w:pStyle w:val="Paragrafoelenco"/>
+        <w:numPr>
+          <w:ilvl w:val="0"/>
+          <w:numId w:val="10"/>
+        </w:numPr>
+        <w:jc w:val="both"/>
+        <w:rPr>
+          <w:rFonts w:cs="Calibri"/>
+        </w:rPr>
+      </w:pPr>
+      <w:r>
+        <w:rPr>
+          <w:rFonts w:cs="Calibri"/>
+          <w:b/>
+          <w:bCs/>
+        </w:rPr>
+        <w:lastRenderedPageBreak/>
+        <w:t>StatsDay</w:t>
+      </w:r>
+      <w:r>
+        <w:rPr>
+          <w:rFonts w:cs="Calibri"/>
+        </w:rPr>
+        <w:t xml:space="preserve"> </w:t>
+      </w:r>
+      <w:r>
+        <w:rPr>
+          <w:rFonts w:cs="Calibri"/>
+        </w:rPr>
+        <w:sym w:font="Wingdings" w:char="F0E0"/>
+      </w:r>
+      <w:r>
+        <w:rPr>
+          <w:rFonts w:cs="Calibri"/>
+        </w:rPr>
+        <w:t xml:space="preserve"> struttura che contiene le statistiche della giornata</w:t>
+      </w:r>
+    </w:p>
+    <w:p>
+      <w:pPr>
+        <w:pStyle w:val="Paragrafoelenco"/>
+        <w:numPr>
+          <w:ilvl w:val="1"/>
+          <w:numId w:val="10"/>
+        </w:numPr>
+        <w:jc w:val="both"/>
+        <w:rPr>
+          <w:rFonts w:cs="Calibri"/>
+        </w:rPr>
+      </w:pPr>
+      <w:r>
+        <w:rPr>
+          <w:rFonts w:cs="Calibri"/>
+        </w:rPr>
+        <w:t>utenti_serviti</w:t>
+      </w:r>
+    </w:p>
+    <w:p>
+      <w:pPr>
+        <w:pStyle w:val="Paragrafoelenco"/>
+        <w:numPr>
+          <w:ilvl w:val="1"/>
+          <w:numId w:val="10"/>
+        </w:numPr>
+        <w:jc w:val="both"/>
+        <w:rPr>
+          <w:rFonts w:cs="Calibri"/>
+        </w:rPr>
+      </w:pPr>
+      <w:r>
+        <w:rPr>
+          <w:rFonts w:cs="Calibri"/>
+        </w:rPr>
+        <w:t xml:space="preserve">servizi_erogati[NUM_SERVIZI] </w:t>
+      </w:r>
+    </w:p>
+    <w:p>
+      <w:pPr>
+        <w:pStyle w:val="Paragrafoelenco"/>
+        <w:numPr>
+          <w:ilvl w:val="1"/>
+          <w:numId w:val="10"/>
+        </w:numPr>
+        <w:jc w:val="both"/>
+        <w:rPr>
+          <w:rFonts w:cs="Calibri"/>
+        </w:rPr>
+      </w:pPr>
+      <w:r>
+        <w:rPr>
+          <w:rFonts w:cs="Calibri"/>
+        </w:rPr>
+        <w:t>servizi_</w:t>
+      </w:r>
+      <w:r>
+        <w:rPr>
+          <w:rFonts w:cs="Calibri"/>
+        </w:rPr>
+        <w:t>non_</w:t>
+      </w:r>
+      <w:r>
+        <w:rPr>
+          <w:rFonts w:cs="Calibri"/>
+        </w:rPr>
+        <w:t>erogati[NUM_SERVIZI]</w:t>
+      </w:r>
+    </w:p>
+    <w:p>
+      <w:pPr>
+        <w:pStyle w:val="Paragrafoelenco"/>
+        <w:numPr>
+          <w:ilvl w:val="1"/>
+          <w:numId w:val="10"/>
+        </w:numPr>
+        <w:jc w:val="both"/>
+        <w:rPr>
+          <w:rFonts w:cs="Calibri"/>
+        </w:rPr>
+      </w:pPr>
+      <w:r>
+        <w:rPr>
+          <w:rFonts w:cs="Calibri"/>
+        </w:rPr>
+        <w:t>tempo_attesa_utenti</w:t>
+      </w:r>
+    </w:p>
+    <w:p>
+      <w:pPr>
+        <w:pStyle w:val="Paragrafoelenco"/>
+        <w:numPr>
+          <w:ilvl w:val="1"/>
+          <w:numId w:val="10"/>
+        </w:numPr>
+        <w:jc w:val="both"/>
+        <w:rPr>
+          <w:rFonts w:cs="Calibri"/>
+        </w:rPr>
+      </w:pPr>
+      <w:r>
+        <w:rPr>
+          <w:rFonts w:cs="Calibri"/>
+        </w:rPr>
+        <w:t xml:space="preserve">tempo_erogazione_servizio </w:t>
+      </w:r>
+      <w:r>
+        <w:rPr>
+          <w:rFonts w:cs="Calibri"/>
+        </w:rPr>
+        <w:t xml:space="preserve">[NUM_SERVIZI] </w:t>
+      </w:r>
+    </w:p>
+    <w:p>
+      <w:pPr>
+        <w:pStyle w:val="Paragrafoelenco"/>
+        <w:numPr>
+          <w:ilvl w:val="1"/>
+          <w:numId w:val="10"/>
+        </w:numPr>
+        <w:jc w:val="both"/>
+        <w:rPr>
+          <w:rFonts w:cs="Calibri"/>
+        </w:rPr>
+      </w:pPr>
+      <w:r>
+        <w:rPr>
+          <w:rFonts w:cs="Calibri"/>
+        </w:rPr>
+        <w:t xml:space="preserve"> </w:t>
+      </w:r>
+      <w:r>
+        <w:rPr>
+          <w:rFonts w:cs="Calibri"/>
+        </w:rPr>
+        <w:t>operatori_attivi</w:t>
+      </w:r>
+    </w:p>
+    <w:p>
+      <w:pPr>
+        <w:pStyle w:val="Paragrafoelenco"/>
+        <w:numPr>
+          <w:ilvl w:val="1"/>
+          <w:numId w:val="10"/>
+        </w:numPr>
+        <w:jc w:val="both"/>
+        <w:rPr>
+          <w:rFonts w:cs="Calibri"/>
+        </w:rPr>
+      </w:pPr>
+      <w:r>
+        <w:rPr>
+          <w:rFonts w:cs="Calibri"/>
+        </w:rPr>
+        <w:t>pause_giornata</w:t>
+      </w:r>
+    </w:p>
+    <w:p>
+      <w:pPr>
+        <w:pStyle w:val="Paragrafoelenco"/>
+        <w:ind w:left="1425"/>
+        <w:jc w:val="both"/>
+        <w:rPr>
+          <w:rFonts w:cs="Calibri"/>
+        </w:rPr>
+      </w:pPr>
+    </w:p>
+    <w:p>
+      <w:pPr>
+        <w:pStyle w:val="Paragrafoelenco"/>
+        <w:numPr>
+          <w:ilvl w:val="0"/>
+          <w:numId w:val="10"/>
+        </w:numPr>
+        <w:jc w:val="both"/>
+        <w:rPr>
+          <w:rFonts w:cs="Calibri"/>
+        </w:rPr>
+      </w:pPr>
+      <w:r>
+        <w:rPr>
+          <w:rFonts w:cs="Calibri"/>
+          <w:b/>
+          <w:bCs/>
+        </w:rPr>
+        <w:t>StatsSim</w:t>
+      </w:r>
+      <w:r>
+        <w:rPr>
+          <w:rFonts w:cs="Calibri"/>
+        </w:rPr>
+        <w:t xml:space="preserve"> </w:t>
+      </w:r>
+      <w:r>
+        <w:rPr>
+          <w:rFonts w:cs="Calibri"/>
+        </w:rPr>
+        <w:sym w:font="Wingdings" w:char="F0E0"/>
+      </w:r>
+      <w:r>
+        <w:rPr>
+          <w:rFonts w:cs="Calibri"/>
+        </w:rPr>
+        <w:t xml:space="preserve"> struttura che contiene le statistiche dell’intera simulazione</w:t>
+      </w:r>
+    </w:p>
+    <w:p>
+      <w:pPr>
+        <w:pStyle w:val="Paragrafoelenco"/>
+        <w:numPr>
+          <w:ilvl w:val="1"/>
+          <w:numId w:val="10"/>
+        </w:numPr>
+        <w:jc w:val="both"/>
+        <w:rPr>
+          <w:rFonts w:cs="Calibri"/>
+        </w:rPr>
+      </w:pPr>
+      <w:r>
+        <w:rPr>
+          <w:rFonts w:cs="Calibri"/>
+        </w:rPr>
+        <w:t>utenti_serviti_tot</w:t>
+      </w:r>
+    </w:p>
+    <w:p>
+      <w:pPr>
+        <w:pStyle w:val="Paragrafoelenco"/>
+        <w:numPr>
+          <w:ilvl w:val="1"/>
+          <w:numId w:val="10"/>
+        </w:numPr>
+        <w:jc w:val="both"/>
+        <w:rPr>
+          <w:rFonts w:cs="Calibri"/>
+        </w:rPr>
+      </w:pPr>
+      <w:r>
+        <w:rPr>
+          <w:rFonts w:cs="Calibri"/>
+        </w:rPr>
+        <w:t>servizi_erogati</w:t>
+      </w:r>
+      <w:r>
+        <w:rPr>
+          <w:rFonts w:cs="Calibri"/>
+        </w:rPr>
+        <w:t>_tot</w:t>
+      </w:r>
+      <w:r>
+        <w:rPr>
+          <w:rFonts w:cs="Calibri"/>
+        </w:rPr>
+        <w:t xml:space="preserve">[NUM_SERVIZI] </w:t>
+      </w:r>
+    </w:p>
+    <w:p>
+      <w:pPr>
+        <w:pStyle w:val="Paragrafoelenco"/>
+        <w:numPr>
+          <w:ilvl w:val="1"/>
+          <w:numId w:val="10"/>
+        </w:numPr>
+        <w:jc w:val="both"/>
+        <w:rPr>
+          <w:rFonts w:cs="Calibri"/>
+        </w:rPr>
+      </w:pPr>
+      <w:r>
+        <w:rPr>
+          <w:rFonts w:cs="Calibri"/>
+        </w:rPr>
+        <w:t>servizi_</w:t>
+      </w:r>
+      <w:r>
+        <w:rPr>
+          <w:rFonts w:cs="Calibri"/>
+        </w:rPr>
+        <w:t>non_</w:t>
+      </w:r>
+      <w:r>
+        <w:rPr>
+          <w:rFonts w:cs="Calibri"/>
+        </w:rPr>
+        <w:t>erogati</w:t>
+      </w:r>
+      <w:r>
+        <w:rPr>
+          <w:rFonts w:cs="Calibri"/>
+        </w:rPr>
+        <w:t>_tot</w:t>
+      </w:r>
+      <w:r>
+        <w:rPr>
+          <w:rFonts w:cs="Calibri"/>
+        </w:rPr>
+        <w:t xml:space="preserve">[NUM_SERVIZI] </w:t>
+      </w:r>
+    </w:p>
+    <w:p>
+      <w:pPr>
+        <w:pStyle w:val="Paragrafoelenco"/>
+        <w:numPr>
+          <w:ilvl w:val="1"/>
+          <w:numId w:val="10"/>
+        </w:numPr>
+        <w:jc w:val="both"/>
+        <w:rPr>
+          <w:rFonts w:cs="Calibri"/>
+        </w:rPr>
+      </w:pPr>
+      <w:r>
+        <w:rPr>
+          <w:rFonts w:cs="Calibri"/>
+        </w:rPr>
+        <w:t>servizi_non_erogati_media_giorno</w:t>
+      </w:r>
+      <w:r>
+        <w:rPr>
+          <w:rFonts w:cs="Calibri"/>
+        </w:rPr>
+        <w:t xml:space="preserve">[NUM_SERVIZI] </w:t>
+      </w:r>
+    </w:p>
+    <w:p>
+      <w:pPr>
+        <w:pStyle w:val="Paragrafoelenco"/>
+        <w:numPr>
+          <w:ilvl w:val="1"/>
+          <w:numId w:val="10"/>
+        </w:numPr>
+        <w:jc w:val="both"/>
+        <w:rPr>
+          <w:rFonts w:cs="Calibri"/>
+        </w:rPr>
+      </w:pPr>
+      <w:r>
+        <w:rPr>
+          <w:rFonts w:cs="Calibri"/>
+        </w:rPr>
+        <w:t>tempo_attesa_utenti_tot</w:t>
+      </w:r>
+    </w:p>
+    <w:p>
+      <w:pPr>
+        <w:pStyle w:val="Paragrafoelenco"/>
+        <w:numPr>
+          <w:ilvl w:val="1"/>
+          <w:numId w:val="10"/>
+        </w:numPr>
+        <w:jc w:val="both"/>
+        <w:rPr>
+          <w:rFonts w:cs="Calibri"/>
+        </w:rPr>
+      </w:pPr>
+      <w:r>
+        <w:rPr>
+          <w:rFonts w:cs="Calibri"/>
+        </w:rPr>
+        <w:t>tempo_erogazione_servizi_tot[NUM_SERVIZI]</w:t>
+      </w:r>
+    </w:p>
+    <w:p>
+      <w:pPr>
+        <w:pStyle w:val="Paragrafoelenco"/>
+        <w:numPr>
+          <w:ilvl w:val="1"/>
+          <w:numId w:val="10"/>
+        </w:numPr>
+        <w:jc w:val="both"/>
+        <w:rPr>
+          <w:rFonts w:cs="Calibri"/>
+        </w:rPr>
+      </w:pPr>
+      <w:r>
+        <w:rPr>
+          <w:rFonts w:cs="Calibri"/>
+        </w:rPr>
+        <w:t>operatori_attivi_tot</w:t>
+      </w:r>
+    </w:p>
+    <w:p>
+      <w:pPr>
+        <w:pStyle w:val="Paragrafoelenco"/>
+        <w:numPr>
+          <w:ilvl w:val="1"/>
+          <w:numId w:val="10"/>
+        </w:numPr>
+        <w:jc w:val="both"/>
+        <w:rPr>
+          <w:rFonts w:cs="Calibri"/>
+        </w:rPr>
+      </w:pPr>
+      <w:r>
+        <w:rPr>
+          <w:rFonts w:cs="Calibri"/>
+        </w:rPr>
+        <w:t>pause_tot</w:t>
+      </w:r>
+    </w:p>
+    <w:p>
+      <w:pPr>
+        <w:pStyle w:val="Paragrafoelenco"/>
+        <w:numPr>
+          <w:ilvl w:val="1"/>
+          <w:numId w:val="10"/>
+        </w:numPr>
+        <w:jc w:val="both"/>
+        <w:rPr>
+          <w:rFonts w:cs="Calibri"/>
+        </w:rPr>
+      </w:pPr>
+      <w:r>
+        <w:rPr>
+          <w:rFonts w:cs="Calibri"/>
+        </w:rPr>
+        <w:t>rapporto_op_sportelli_media[MAX_SPORTELLI]</w:t>
+      </w:r>
+    </w:p>
+    <w:p>
+      <w:pPr>
+        <w:pStyle w:val="Paragrafoelenco"/>
+        <w:ind w:left="1425"/>
+        <w:jc w:val="both"/>
+        <w:rPr>
+          <w:rFonts w:cs="Calibri"/>
+        </w:rPr>
+      </w:pPr>
+    </w:p>
+    <w:p>
+      <w:pPr>
+        <w:pStyle w:val="Paragrafoelenco"/>
+        <w:numPr>
+          <w:ilvl w:val="0"/>
+          <w:numId w:val="10"/>
+        </w:numPr>
+        <w:jc w:val="both"/>
+        <w:rPr>
+          <w:rFonts w:cs="Calibri"/>
+        </w:rPr>
+      </w:pPr>
+      <w:r>
+        <w:rPr>
+          <w:rFonts w:cs="Calibri"/>
+          <w:b/>
+          <w:bCs/>
+        </w:rPr>
+        <w:t>struct msgbuf</w:t>
+      </w:r>
+      <w:r>
+        <w:rPr>
+          <w:rFonts w:cs="Calibri"/>
+        </w:rPr>
+        <w:t xml:space="preserve"> </w:t>
+      </w:r>
+      <w:r>
+        <w:rPr>
+          <w:rFonts w:cs="Calibri"/>
+        </w:rPr>
+        <w:sym w:font="Wingdings" w:char="F0E0"/>
+      </w:r>
+      <w:r>
+        <w:rPr>
+          <w:rFonts w:cs="Calibri"/>
+        </w:rPr>
+        <w:t xml:space="preserve"> struttura per i messaggi nella coda tra utenti e sportelli</w:t>
+      </w:r>
+    </w:p>
+    <w:p>
+      <w:pPr>
+        <w:pStyle w:val="Paragrafoelenco"/>
+        <w:numPr>
+          <w:ilvl w:val="0"/>
+          <w:numId w:val="10"/>
+        </w:numPr>
+        <w:jc w:val="both"/>
+        <w:rPr>
+          <w:rFonts w:cs="Calibri"/>
+        </w:rPr>
+      </w:pPr>
+      <w:r>
+        <w:rPr>
+          <w:rFonts w:cs="Calibri"/>
+          <w:b/>
+          <w:bCs/>
+        </w:rPr>
+        <w:t>Sportello</w:t>
+      </w:r>
+      <w:r>
+        <w:rPr>
+          <w:rFonts w:cs="Calibri"/>
+        </w:rPr>
+        <w:t xml:space="preserve"> </w:t>
+      </w:r>
+      <w:r>
+        <w:rPr>
+          <w:rFonts w:cs="Calibri"/>
+        </w:rPr>
+        <w:sym w:font="Wingdings" w:char="F0E0"/>
+      </w:r>
+      <w:r>
+        <w:rPr>
+          <w:rFonts w:cs="Calibri"/>
+        </w:rPr>
+        <w:t xml:space="preserve"> struttura che contiene il tipo di lavoro assegnato</w:t>
+      </w:r>
+    </w:p>
+    <w:p>
+      <w:pPr>
+        <w:pStyle w:val="Paragrafoelenco"/>
+        <w:numPr>
+          <w:ilvl w:val="0"/>
+          <w:numId w:val="10"/>
+        </w:numPr>
+        <w:jc w:val="both"/>
+        <w:rPr>
+          <w:rFonts w:cs="Calibri"/>
+        </w:rPr>
+      </w:pPr>
+      <w:r>
+        <w:rPr>
+          <w:rFonts w:cs="Calibri"/>
+          <w:b/>
+          <w:bCs/>
+        </w:rPr>
+        <w:t>WorkerMsg</w:t>
+      </w:r>
+      <w:r>
+        <w:rPr>
+          <w:rFonts w:cs="Calibri"/>
+        </w:rPr>
+        <w:t xml:space="preserve"> </w:t>
+      </w:r>
+      <w:r>
+        <w:rPr>
+          <w:rFonts w:cs="Calibri"/>
+        </w:rPr>
+        <w:sym w:font="Wingdings" w:char="F0E0"/>
+      </w:r>
+      <w:r>
+        <w:rPr>
+          <w:rFonts w:cs="Calibri"/>
+        </w:rPr>
+        <w:t xml:space="preserve"> struttura usata dai lavorati per scambiare messaggi con il direttore</w:t>
+      </w:r>
+    </w:p>
+    <w:p>
+      <w:pPr>
+        <w:pStyle w:val="Paragrafoelenco"/>
+        <w:ind w:left="1425"/>
+        <w:jc w:val="both"/>
+        <w:rPr>
+          <w:rFonts w:cs="Calibri"/>
+        </w:rPr>
+      </w:pPr>
+    </w:p>
+    <w:p>
+      <w:pPr>
+        <w:pStyle w:val="Paragrafoelenco"/>
+        <w:numPr>
+          <w:ilvl w:val="0"/>
+          <w:numId w:val="10"/>
+        </w:numPr>
+        <w:jc w:val="both"/>
+        <w:rPr>
+          <w:rFonts w:cs="Calibri"/>
+        </w:rPr>
+      </w:pPr>
+      <w:r>
+        <w:rPr>
+          <w:rFonts w:cs="Calibri"/>
+          <w:b/>
+          <w:bCs/>
+        </w:rPr>
+        <w:t>TicketMsg</w:t>
+      </w:r>
+      <w:r>
+        <w:rPr>
+          <w:rFonts w:cs="Calibri"/>
+        </w:rPr>
+        <w:t xml:space="preserve"> </w:t>
+      </w:r>
+      <w:r>
+        <w:rPr>
+          <w:rFonts w:cs="Calibri"/>
+        </w:rPr>
+        <w:sym w:font="Wingdings" w:char="F0E0"/>
+      </w:r>
+      <w:r>
+        <w:rPr>
+          <w:rFonts w:cs="Calibri"/>
+        </w:rPr>
+        <w:t xml:space="preserve"> struttura usata da utenti per comunicare con erogatoreTicket</w:t>
+      </w:r>
+    </w:p>
+    <w:p>
+      <w:pPr>
+        <w:pStyle w:val="Paragrafoelenco"/>
+        <w:numPr>
+          <w:ilvl w:val="1"/>
+          <w:numId w:val="10"/>
+        </w:numPr>
+        <w:jc w:val="both"/>
+        <w:rPr>
+          <w:rFonts w:cs="Calibri"/>
+        </w:rPr>
+      </w:pPr>
+      <w:r>
+        <w:rPr>
+          <w:rFonts w:cs="Calibri"/>
+          <w:i/>
+          <w:iCs/>
+        </w:rPr>
+        <w:t>mtype</w:t>
+      </w:r>
+      <w:r>
+        <w:rPr>
+          <w:rFonts w:cs="Calibri"/>
+        </w:rPr>
+        <w:t>: tipo del messaggio (1 per richiesta, PID per risposta)</w:t>
+      </w:r>
+    </w:p>
+    <w:p>
+      <w:pPr>
+        <w:pStyle w:val="Paragrafoelenco"/>
+        <w:numPr>
+          <w:ilvl w:val="1"/>
+          <w:numId w:val="10"/>
+        </w:numPr>
+        <w:jc w:val="both"/>
+        <w:rPr>
+          <w:rFonts w:cs="Calibri"/>
+        </w:rPr>
+      </w:pPr>
+      <w:r>
+        <w:rPr>
+          <w:rFonts w:cs="Calibri"/>
+        </w:rPr>
+        <w:t>servizio</w:t>
+      </w:r>
+    </w:p>
+    <w:p>
+      <w:pPr>
+        <w:pStyle w:val="Paragrafoelenco"/>
+        <w:numPr>
+          <w:ilvl w:val="1"/>
+          <w:numId w:val="10"/>
+        </w:numPr>
+        <w:jc w:val="both"/>
+        <w:rPr>
+          <w:rFonts w:cs="Calibri"/>
+        </w:rPr>
+      </w:pPr>
+      <w:r>
+        <w:rPr>
+          <w:rFonts w:cs="Calibri"/>
+          <w:i/>
+          <w:iCs/>
+        </w:rPr>
+        <w:t>ticket</w:t>
+      </w:r>
+      <w:r>
+        <w:rPr>
+          <w:rFonts w:cs="Calibri"/>
+        </w:rPr>
+        <w:t>: numero del ticket (inviato solo in risposta)</w:t>
+      </w:r>
+    </w:p>
+    <w:p>
+      <w:pPr>
+        <w:pStyle w:val="Paragrafoelenco"/>
+        <w:numPr>
+          <w:ilvl w:val="1"/>
+          <w:numId w:val="10"/>
+        </w:numPr>
+        <w:jc w:val="both"/>
+        <w:rPr>
+          <w:rFonts w:cs="Calibri"/>
+        </w:rPr>
+      </w:pPr>
+      <w:r>
+        <w:rPr>
+          <w:rFonts w:cs="Calibri"/>
+          <w:i/>
+          <w:iCs/>
+        </w:rPr>
+        <w:t>pid</w:t>
+      </w:r>
+      <w:r>
+        <w:rPr>
+          <w:rFonts w:cs="Calibri"/>
+        </w:rPr>
+        <w:t xml:space="preserve"> (solo in richiesta)</w:t>
+      </w:r>
+    </w:p>
+    <w:p>
+      <w:pPr>
+        <w:pStyle w:val="Paragrafoelenco"/>
+        <w:ind w:left="1425"/>
+        <w:jc w:val="both"/>
+        <w:rPr>
+          <w:rFonts w:cs="Calibri"/>
+        </w:rPr>
+      </w:pPr>
+    </w:p>
+    <w:p>
+      <w:pPr>
+        <w:pStyle w:val="Paragrafoelenco"/>
+        <w:numPr>
+          <w:ilvl w:val="0"/>
+          <w:numId w:val="10"/>
+        </w:numPr>
+        <w:jc w:val="both"/>
+        <w:rPr>
+          <w:rFonts w:cs="Calibri"/>
+        </w:rPr>
+      </w:pPr>
+      <w:r>
+        <w:rPr>
+          <w:rFonts w:cs="Calibri"/>
+          <w:b/>
+          <w:bCs/>
+        </w:rPr>
+        <w:t>Ticket/TicketPtr</w:t>
+      </w:r>
+      <w:r>
+        <w:rPr>
+          <w:rFonts w:cs="Calibri"/>
+        </w:rPr>
+        <w:t xml:space="preserve"> </w:t>
+      </w:r>
+      <w:r>
+        <w:rPr>
+          <w:rFonts w:cs="Calibri"/>
+        </w:rPr>
+        <w:sym w:font="Wingdings" w:char="F0E0"/>
+      </w:r>
+      <w:r>
+        <w:rPr>
+          <w:rFonts w:cs="Calibri"/>
+        </w:rPr>
+        <w:t xml:space="preserve"> struttura che rappresenta il ticket </w:t>
+      </w:r>
+    </w:p>
+    <w:p>
+      <w:pPr>
+        <w:pStyle w:val="Paragrafoelenco"/>
+        <w:numPr>
+          <w:ilvl w:val="1"/>
+          <w:numId w:val="10"/>
+        </w:numPr>
+        <w:jc w:val="both"/>
+        <w:rPr>
+          <w:rFonts w:cs="Calibri"/>
+        </w:rPr>
+      </w:pPr>
+      <w:r>
+        <w:rPr>
+          <w:rFonts w:cs="Calibri"/>
+        </w:rPr>
+        <w:t>type: servizio richiesto</w:t>
+      </w:r>
+    </w:p>
+    <w:p>
+      <w:pPr>
+        <w:pStyle w:val="Paragrafoelenco"/>
+        <w:numPr>
+          <w:ilvl w:val="1"/>
+          <w:numId w:val="10"/>
+        </w:numPr>
+        <w:jc w:val="both"/>
+        <w:rPr>
+          <w:rFonts w:cs="Calibri"/>
+        </w:rPr>
+      </w:pPr>
+      <w:r>
+        <w:rPr>
+          <w:rFonts w:cs="Calibri"/>
+        </w:rPr>
+        <w:t>time: tempo necessario per erogare il servizio</w:t>
+      </w:r>
+    </w:p>
+    <w:p>
+      <w:pPr>
+        <w:jc w:val="both"/>
+        <w:rPr>
+          <w:rFonts w:cs="Calibri"/>
+        </w:rPr>
+      </w:pPr>
+    </w:p>
+    <w:p>
+      <w:pPr>
+        <w:jc w:val="both"/>
+        <w:rPr>
+          <w:rFonts w:cs="Calibri"/>
+        </w:rPr>
+      </w:pPr>
+    </w:p>
+    <w:p>
+      <w:pPr>
+        <w:pStyle w:val="Paragrafoelenco"/>
+        <w:numPr>
+          <w:ilvl w:val="0"/>
+          <w:numId w:val="12"/>
+        </w:numPr>
+        <w:jc w:val="both"/>
+        <w:rPr>
+          <w:rFonts w:cs="Calibri"/>
+        </w:rPr>
+      </w:pPr>
+      <w:r>
+        <w:rPr>
+          <w:rFonts w:ascii="Courier New" w:hAnsi="Courier New" w:cs="Courier New"/>
+          <w:b/>
+          <w:bCs/>
+          <w:sz w:val="28"/>
+          <w:szCs w:val="28"/>
+        </w:rPr>
+        <w:t>functions.h</w:t>
+      </w:r>
+      <w:r>
+        <w:rPr>
+          <w:rFonts w:cs="Calibri"/>
+          <w:sz w:val="28"/>
+          <w:szCs w:val="28"/>
+        </w:rPr>
+        <w:t xml:space="preserve"> </w:t>
+      </w:r>
+      <w:r>
+        <w:sym w:font="Wingdings" w:char="F0E0"/>
+      </w:r>
+      <w:r>
+        <w:rPr>
+          <w:rFonts w:cs="Calibri"/>
+        </w:rPr>
+        <w:t xml:space="preserve"> comprende tutte le funzioni</w:t>
+      </w:r>
+      <w:r>
+        <w:rPr>
+          <w:rFonts w:cs="Calibri"/>
+        </w:rPr>
+        <w:t xml:space="preserve"> utilizzate all’interno del codice dei vari processi</w:t>
       </w:r>
     </w:p>
     <w:p>
@@ -1717,7 +3464,7 @@
           <w:szCs w:val="36"/>
         </w:rPr>
       </w:pPr>
-      <w:bookmarkStart w:id="2" w:name="_Toc204443702"/>
+      <w:bookmarkStart w:id="2" w:name="_Toc204615398"/>
       <w:r>
         <w:rPr>
           <w:rFonts w:cs="Calibri"/>
@@ -1774,7 +3521,7 @@
           <w:szCs w:val="36"/>
         </w:rPr>
       </w:pPr>
-      <w:bookmarkStart w:id="3" w:name="_Toc204443703"/>
+      <w:bookmarkStart w:id="3" w:name="_Toc204615399"/>
       <w:r>
         <w:rPr>
           <w:rFonts w:cs="Calibri"/>
@@ -1829,9 +3576,10 @@
           <w:color w:val="156082" w:themeColor="accent1"/>
           <w:sz w:val="36"/>
           <w:szCs w:val="36"/>
-        </w:rPr>
-      </w:pPr>
-      <w:bookmarkStart w:id="4" w:name="_Toc204443704"/>
+          <w:u w:val="single"/>
+        </w:rPr>
+      </w:pPr>
+      <w:bookmarkStart w:id="4" w:name="_Toc204615400"/>
       <w:r>
         <w:rPr>
           <w:rFonts w:cs="Calibri"/>
@@ -2268,6 +4016,205 @@
     </w:lvl>
   </w:abstractNum>
   <w:abstractNum w:abstractNumId="3" w15:restartNumberingAfterBreak="0">
+    <w:nsid w:val="272E52A2"/>
+    <w:multiLevelType w:val="hybridMultilevel"/>
+    <w:tmpl w:val="C9E60B06"/>
+    <w:lvl w:ilvl="0" w:tplc="0410000F">
+      <w:start w:val="1"/>
+      <w:numFmt w:val="decimal"/>
+      <w:lvlText w:val="%1."/>
+      <w:lvlJc w:val="left"/>
+      <w:pPr>
+        <w:ind w:left="720" w:hanging="360"/>
+      </w:pPr>
+    </w:lvl>
+    <w:lvl w:ilvl="1" w:tplc="04100019" w:tentative="1">
+      <w:start w:val="1"/>
+      <w:numFmt w:val="lowerLetter"/>
+      <w:lvlText w:val="%2."/>
+      <w:lvlJc w:val="left"/>
+      <w:pPr>
+        <w:ind w:left="1440" w:hanging="360"/>
+      </w:pPr>
+    </w:lvl>
+    <w:lvl w:ilvl="2" w:tplc="0410001B" w:tentative="1">
+      <w:start w:val="1"/>
+      <w:numFmt w:val="lowerRoman"/>
+      <w:lvlText w:val="%3."/>
+      <w:lvlJc w:val="right"/>
+      <w:pPr>
+        <w:ind w:left="2160" w:hanging="180"/>
+      </w:pPr>
+    </w:lvl>
+    <w:lvl w:ilvl="3" w:tplc="0410000F" w:tentative="1">
+      <w:start w:val="1"/>
+      <w:numFmt w:val="decimal"/>
+      <w:lvlText w:val="%4."/>
+      <w:lvlJc w:val="left"/>
+      <w:pPr>
+        <w:ind w:left="2880" w:hanging="360"/>
+      </w:pPr>
+    </w:lvl>
+    <w:lvl w:ilvl="4" w:tplc="04100019" w:tentative="1">
+      <w:start w:val="1"/>
+      <w:numFmt w:val="lowerLetter"/>
+      <w:lvlText w:val="%5."/>
+      <w:lvlJc w:val="left"/>
+      <w:pPr>
+        <w:ind w:left="3600" w:hanging="360"/>
+      </w:pPr>
+    </w:lvl>
+    <w:lvl w:ilvl="5" w:tplc="0410001B" w:tentative="1">
+      <w:start w:val="1"/>
+      <w:numFmt w:val="lowerRoman"/>
+      <w:lvlText w:val="%6."/>
+      <w:lvlJc w:val="right"/>
+      <w:pPr>
+        <w:ind w:left="4320" w:hanging="180"/>
+      </w:pPr>
+    </w:lvl>
+    <w:lvl w:ilvl="6" w:tplc="0410000F" w:tentative="1">
+      <w:start w:val="1"/>
+      <w:numFmt w:val="decimal"/>
+      <w:lvlText w:val="%7."/>
+      <w:lvlJc w:val="left"/>
+      <w:pPr>
+        <w:ind w:left="5040" w:hanging="360"/>
+      </w:pPr>
+    </w:lvl>
+    <w:lvl w:ilvl="7" w:tplc="04100019" w:tentative="1">
+      <w:start w:val="1"/>
+      <w:numFmt w:val="lowerLetter"/>
+      <w:lvlText w:val="%8."/>
+      <w:lvlJc w:val="left"/>
+      <w:pPr>
+        <w:ind w:left="5760" w:hanging="360"/>
+      </w:pPr>
+    </w:lvl>
+    <w:lvl w:ilvl="8" w:tplc="0410001B" w:tentative="1">
+      <w:start w:val="1"/>
+      <w:numFmt w:val="lowerRoman"/>
+      <w:lvlText w:val="%9."/>
+      <w:lvlJc w:val="right"/>
+      <w:pPr>
+        <w:ind w:left="6480" w:hanging="180"/>
+      </w:pPr>
+    </w:lvl>
+  </w:abstractNum>
+  <w:abstractNum w:abstractNumId="4" w15:restartNumberingAfterBreak="0">
+    <w:nsid w:val="39C44CC2"/>
+    <w:multiLevelType w:val="hybridMultilevel"/>
+    <w:tmpl w:val="E7C87126"/>
+    <w:lvl w:ilvl="0" w:tplc="04100001">
+      <w:start w:val="1"/>
+      <w:numFmt w:val="bullet"/>
+      <w:lvlText w:val=""/>
+      <w:lvlJc w:val="left"/>
+      <w:pPr>
+        <w:ind w:left="1425" w:hanging="360"/>
+      </w:pPr>
+      <w:rPr>
+        <w:rFonts w:ascii="Symbol" w:hAnsi="Symbol" w:hint="default"/>
+      </w:rPr>
+    </w:lvl>
+    <w:lvl w:ilvl="1" w:tplc="04100003">
+      <w:start w:val="1"/>
+      <w:numFmt w:val="bullet"/>
+      <w:lvlText w:val="o"/>
+      <w:lvlJc w:val="left"/>
+      <w:pPr>
+        <w:ind w:left="2145" w:hanging="360"/>
+      </w:pPr>
+      <w:rPr>
+        <w:rFonts w:ascii="Courier New" w:hAnsi="Courier New" w:cs="Courier New" w:hint="default"/>
+      </w:rPr>
+    </w:lvl>
+    <w:lvl w:ilvl="2" w:tplc="04100005" w:tentative="1">
+      <w:start w:val="1"/>
+      <w:numFmt w:val="bullet"/>
+      <w:lvlText w:val=""/>
+      <w:lvlJc w:val="left"/>
+      <w:pPr>
+        <w:ind w:left="2865" w:hanging="360"/>
+      </w:pPr>
+      <w:rPr>
+        <w:rFonts w:ascii="Wingdings" w:hAnsi="Wingdings" w:hint="default"/>
+      </w:rPr>
+    </w:lvl>
+    <w:lvl w:ilvl="3" w:tplc="04100001" w:tentative="1">
+      <w:start w:val="1"/>
+      <w:numFmt w:val="bullet"/>
+      <w:lvlText w:val=""/>
+      <w:lvlJc w:val="left"/>
+      <w:pPr>
+        <w:ind w:left="3585" w:hanging="360"/>
+      </w:pPr>
+      <w:rPr>
+        <w:rFonts w:ascii="Symbol" w:hAnsi="Symbol" w:hint="default"/>
+      </w:rPr>
+    </w:lvl>
+    <w:lvl w:ilvl="4" w:tplc="04100003" w:tentative="1">
+      <w:start w:val="1"/>
+      <w:numFmt w:val="bullet"/>
+      <w:lvlText w:val="o"/>
+      <w:lvlJc w:val="left"/>
+      <w:pPr>
+        <w:ind w:left="4305" w:hanging="360"/>
+      </w:pPr>
+      <w:rPr>
+        <w:rFonts w:ascii="Courier New" w:hAnsi="Courier New" w:cs="Courier New" w:hint="default"/>
+      </w:rPr>
+    </w:lvl>
+    <w:lvl w:ilvl="5" w:tplc="04100005" w:tentative="1">
+      <w:start w:val="1"/>
+      <w:numFmt w:val="bullet"/>
+      <w:lvlText w:val=""/>
+      <w:lvlJc w:val="left"/>
+      <w:pPr>
+        <w:ind w:left="5025" w:hanging="360"/>
+      </w:pPr>
+      <w:rPr>
+        <w:rFonts w:ascii="Wingdings" w:hAnsi="Wingdings" w:hint="default"/>
+      </w:rPr>
+    </w:lvl>
+    <w:lvl w:ilvl="6" w:tplc="04100001" w:tentative="1">
+      <w:start w:val="1"/>
+      <w:numFmt w:val="bullet"/>
+      <w:lvlText w:val=""/>
+      <w:lvlJc w:val="left"/>
+      <w:pPr>
+        <w:ind w:left="5745" w:hanging="360"/>
+      </w:pPr>
+      <w:rPr>
+        <w:rFonts w:ascii="Symbol" w:hAnsi="Symbol" w:hint="default"/>
+      </w:rPr>
+    </w:lvl>
+    <w:lvl w:ilvl="7" w:tplc="04100003" w:tentative="1">
+      <w:start w:val="1"/>
+      <w:numFmt w:val="bullet"/>
+      <w:lvlText w:val="o"/>
+      <w:lvlJc w:val="left"/>
+      <w:pPr>
+        <w:ind w:left="6465" w:hanging="360"/>
+      </w:pPr>
+      <w:rPr>
+        <w:rFonts w:ascii="Courier New" w:hAnsi="Courier New" w:cs="Courier New" w:hint="default"/>
+      </w:rPr>
+    </w:lvl>
+    <w:lvl w:ilvl="8" w:tplc="04100005" w:tentative="1">
+      <w:start w:val="1"/>
+      <w:numFmt w:val="bullet"/>
+      <w:lvlText w:val=""/>
+      <w:lvlJc w:val="left"/>
+      <w:pPr>
+        <w:ind w:left="7185" w:hanging="360"/>
+      </w:pPr>
+      <w:rPr>
+        <w:rFonts w:ascii="Wingdings" w:hAnsi="Wingdings" w:hint="default"/>
+      </w:rPr>
+    </w:lvl>
+  </w:abstractNum>
+  <w:abstractNum w:abstractNumId="5" w15:restartNumberingAfterBreak="0">
     <w:nsid w:val="4D6C6C2B"/>
     <w:multiLevelType w:val="hybridMultilevel"/>
     <w:tmpl w:val="F90E3234"/>
@@ -2356,7 +4303,7 @@
       </w:pPr>
     </w:lvl>
   </w:abstractNum>
-  <w:abstractNum w:abstractNumId="4" w15:restartNumberingAfterBreak="0">
+  <w:abstractNum w:abstractNumId="6" w15:restartNumberingAfterBreak="0">
     <w:nsid w:val="62B15CE4"/>
     <w:multiLevelType w:val="hybridMultilevel"/>
     <w:tmpl w:val="D6E8352C"/>
@@ -2469,7 +4416,206 @@
       </w:rPr>
     </w:lvl>
   </w:abstractNum>
-  <w:abstractNum w:abstractNumId="5" w15:restartNumberingAfterBreak="0">
+  <w:abstractNum w:abstractNumId="7" w15:restartNumberingAfterBreak="0">
+    <w:nsid w:val="66D411B2"/>
+    <w:multiLevelType w:val="hybridMultilevel"/>
+    <w:tmpl w:val="2B9A2806"/>
+    <w:lvl w:ilvl="0" w:tplc="04100001">
+      <w:start w:val="1"/>
+      <w:numFmt w:val="bullet"/>
+      <w:lvlText w:val=""/>
+      <w:lvlJc w:val="left"/>
+      <w:pPr>
+        <w:ind w:left="720" w:hanging="360"/>
+      </w:pPr>
+      <w:rPr>
+        <w:rFonts w:ascii="Symbol" w:hAnsi="Symbol" w:hint="default"/>
+      </w:rPr>
+    </w:lvl>
+    <w:lvl w:ilvl="1" w:tplc="04100003" w:tentative="1">
+      <w:start w:val="1"/>
+      <w:numFmt w:val="bullet"/>
+      <w:lvlText w:val="o"/>
+      <w:lvlJc w:val="left"/>
+      <w:pPr>
+        <w:ind w:left="1440" w:hanging="360"/>
+      </w:pPr>
+      <w:rPr>
+        <w:rFonts w:ascii="Courier New" w:hAnsi="Courier New" w:cs="Courier New" w:hint="default"/>
+      </w:rPr>
+    </w:lvl>
+    <w:lvl w:ilvl="2" w:tplc="04100005" w:tentative="1">
+      <w:start w:val="1"/>
+      <w:numFmt w:val="bullet"/>
+      <w:lvlText w:val=""/>
+      <w:lvlJc w:val="left"/>
+      <w:pPr>
+        <w:ind w:left="2160" w:hanging="360"/>
+      </w:pPr>
+      <w:rPr>
+        <w:rFonts w:ascii="Wingdings" w:hAnsi="Wingdings" w:hint="default"/>
+      </w:rPr>
+    </w:lvl>
+    <w:lvl w:ilvl="3" w:tplc="04100001" w:tentative="1">
+      <w:start w:val="1"/>
+      <w:numFmt w:val="bullet"/>
+      <w:lvlText w:val=""/>
+      <w:lvlJc w:val="left"/>
+      <w:pPr>
+        <w:ind w:left="2880" w:hanging="360"/>
+      </w:pPr>
+      <w:rPr>
+        <w:rFonts w:ascii="Symbol" w:hAnsi="Symbol" w:hint="default"/>
+      </w:rPr>
+    </w:lvl>
+    <w:lvl w:ilvl="4" w:tplc="04100003" w:tentative="1">
+      <w:start w:val="1"/>
+      <w:numFmt w:val="bullet"/>
+      <w:lvlText w:val="o"/>
+      <w:lvlJc w:val="left"/>
+      <w:pPr>
+        <w:ind w:left="3600" w:hanging="360"/>
+      </w:pPr>
+      <w:rPr>
+        <w:rFonts w:ascii="Courier New" w:hAnsi="Courier New" w:cs="Courier New" w:hint="default"/>
+      </w:rPr>
+    </w:lvl>
+    <w:lvl w:ilvl="5" w:tplc="04100005" w:tentative="1">
+      <w:start w:val="1"/>
+      <w:numFmt w:val="bullet"/>
+      <w:lvlText w:val=""/>
+      <w:lvlJc w:val="left"/>
+      <w:pPr>
+        <w:ind w:left="4320" w:hanging="360"/>
+      </w:pPr>
+      <w:rPr>
+        <w:rFonts w:ascii="Wingdings" w:hAnsi="Wingdings" w:hint="default"/>
+      </w:rPr>
+    </w:lvl>
+    <w:lvl w:ilvl="6" w:tplc="04100001" w:tentative="1">
+      <w:start w:val="1"/>
+      <w:numFmt w:val="bullet"/>
+      <w:lvlText w:val=""/>
+      <w:lvlJc w:val="left"/>
+      <w:pPr>
+        <w:ind w:left="5040" w:hanging="360"/>
+      </w:pPr>
+      <w:rPr>
+        <w:rFonts w:ascii="Symbol" w:hAnsi="Symbol" w:hint="default"/>
+      </w:rPr>
+    </w:lvl>
+    <w:lvl w:ilvl="7" w:tplc="04100003" w:tentative="1">
+      <w:start w:val="1"/>
+      <w:numFmt w:val="bullet"/>
+      <w:lvlText w:val="o"/>
+      <w:lvlJc w:val="left"/>
+      <w:pPr>
+        <w:ind w:left="5760" w:hanging="360"/>
+      </w:pPr>
+      <w:rPr>
+        <w:rFonts w:ascii="Courier New" w:hAnsi="Courier New" w:cs="Courier New" w:hint="default"/>
+      </w:rPr>
+    </w:lvl>
+    <w:lvl w:ilvl="8" w:tplc="04100005" w:tentative="1">
+      <w:start w:val="1"/>
+      <w:numFmt w:val="bullet"/>
+      <w:lvlText w:val=""/>
+      <w:lvlJc w:val="left"/>
+      <w:pPr>
+        <w:ind w:left="6480" w:hanging="360"/>
+      </w:pPr>
+      <w:rPr>
+        <w:rFonts w:ascii="Wingdings" w:hAnsi="Wingdings" w:hint="default"/>
+      </w:rPr>
+    </w:lvl>
+  </w:abstractNum>
+  <w:abstractNum w:abstractNumId="8" w15:restartNumberingAfterBreak="0">
+    <w:nsid w:val="673240C0"/>
+    <w:multiLevelType w:val="hybridMultilevel"/>
+    <w:tmpl w:val="8D8CA5CA"/>
+    <w:lvl w:ilvl="0" w:tplc="0410000F">
+      <w:start w:val="1"/>
+      <w:numFmt w:val="decimal"/>
+      <w:lvlText w:val="%1."/>
+      <w:lvlJc w:val="left"/>
+      <w:pPr>
+        <w:ind w:left="1068" w:hanging="360"/>
+      </w:pPr>
+    </w:lvl>
+    <w:lvl w:ilvl="1" w:tplc="04100019">
+      <w:start w:val="1"/>
+      <w:numFmt w:val="lowerLetter"/>
+      <w:lvlText w:val="%2."/>
+      <w:lvlJc w:val="left"/>
+      <w:pPr>
+        <w:ind w:left="1788" w:hanging="360"/>
+      </w:pPr>
+    </w:lvl>
+    <w:lvl w:ilvl="2" w:tplc="0410001B" w:tentative="1">
+      <w:start w:val="1"/>
+      <w:numFmt w:val="lowerRoman"/>
+      <w:lvlText w:val="%3."/>
+      <w:lvlJc w:val="right"/>
+      <w:pPr>
+        <w:ind w:left="2508" w:hanging="180"/>
+      </w:pPr>
+    </w:lvl>
+    <w:lvl w:ilvl="3" w:tplc="0410000F" w:tentative="1">
+      <w:start w:val="1"/>
+      <w:numFmt w:val="decimal"/>
+      <w:lvlText w:val="%4."/>
+      <w:lvlJc w:val="left"/>
+      <w:pPr>
+        <w:ind w:left="3228" w:hanging="360"/>
+      </w:pPr>
+    </w:lvl>
+    <w:lvl w:ilvl="4" w:tplc="04100019" w:tentative="1">
+      <w:start w:val="1"/>
+      <w:numFmt w:val="lowerLetter"/>
+      <w:lvlText w:val="%5."/>
+      <w:lvlJc w:val="left"/>
+      <w:pPr>
+        <w:ind w:left="3948" w:hanging="360"/>
+      </w:pPr>
+    </w:lvl>
+    <w:lvl w:ilvl="5" w:tplc="0410001B" w:tentative="1">
+      <w:start w:val="1"/>
+      <w:numFmt w:val="lowerRoman"/>
+      <w:lvlText w:val="%6."/>
+      <w:lvlJc w:val="right"/>
+      <w:pPr>
+        <w:ind w:left="4668" w:hanging="180"/>
+      </w:pPr>
+    </w:lvl>
+    <w:lvl w:ilvl="6" w:tplc="0410000F" w:tentative="1">
+      <w:start w:val="1"/>
+      <w:numFmt w:val="decimal"/>
+      <w:lvlText w:val="%7."/>
+      <w:lvlJc w:val="left"/>
+      <w:pPr>
+        <w:ind w:left="5388" w:hanging="360"/>
+      </w:pPr>
+    </w:lvl>
+    <w:lvl w:ilvl="7" w:tplc="04100019" w:tentative="1">
+      <w:start w:val="1"/>
+      <w:numFmt w:val="lowerLetter"/>
+      <w:lvlText w:val="%8."/>
+      <w:lvlJc w:val="left"/>
+      <w:pPr>
+        <w:ind w:left="6108" w:hanging="360"/>
+      </w:pPr>
+    </w:lvl>
+    <w:lvl w:ilvl="8" w:tplc="0410001B" w:tentative="1">
+      <w:start w:val="1"/>
+      <w:numFmt w:val="lowerRoman"/>
+      <w:lvlText w:val="%9."/>
+      <w:lvlJc w:val="right"/>
+      <w:pPr>
+        <w:ind w:left="6828" w:hanging="180"/>
+      </w:pPr>
+    </w:lvl>
+  </w:abstractNum>
+  <w:abstractNum w:abstractNumId="9" w15:restartNumberingAfterBreak="0">
     <w:nsid w:val="6769004B"/>
     <w:multiLevelType w:val="hybridMultilevel"/>
     <w:tmpl w:val="B5C6DE6A"/>
@@ -2558,23 +4704,240 @@
       </w:pPr>
     </w:lvl>
   </w:abstractNum>
+  <w:abstractNum w:abstractNumId="10" w15:restartNumberingAfterBreak="0">
+    <w:nsid w:val="697D3199"/>
+    <w:multiLevelType w:val="hybridMultilevel"/>
+    <w:tmpl w:val="EABA93A6"/>
+    <w:lvl w:ilvl="0" w:tplc="04100001">
+      <w:start w:val="1"/>
+      <w:numFmt w:val="bullet"/>
+      <w:lvlText w:val=""/>
+      <w:lvlJc w:val="left"/>
+      <w:pPr>
+        <w:ind w:left="3600" w:hanging="360"/>
+      </w:pPr>
+      <w:rPr>
+        <w:rFonts w:ascii="Symbol" w:hAnsi="Symbol" w:hint="default"/>
+      </w:rPr>
+    </w:lvl>
+    <w:lvl w:ilvl="1" w:tplc="04100003" w:tentative="1">
+      <w:start w:val="1"/>
+      <w:numFmt w:val="bullet"/>
+      <w:lvlText w:val="o"/>
+      <w:lvlJc w:val="left"/>
+      <w:pPr>
+        <w:ind w:left="4320" w:hanging="360"/>
+      </w:pPr>
+      <w:rPr>
+        <w:rFonts w:ascii="Courier New" w:hAnsi="Courier New" w:cs="Courier New" w:hint="default"/>
+      </w:rPr>
+    </w:lvl>
+    <w:lvl w:ilvl="2" w:tplc="04100005" w:tentative="1">
+      <w:start w:val="1"/>
+      <w:numFmt w:val="bullet"/>
+      <w:lvlText w:val=""/>
+      <w:lvlJc w:val="left"/>
+      <w:pPr>
+        <w:ind w:left="5040" w:hanging="360"/>
+      </w:pPr>
+      <w:rPr>
+        <w:rFonts w:ascii="Wingdings" w:hAnsi="Wingdings" w:hint="default"/>
+      </w:rPr>
+    </w:lvl>
+    <w:lvl w:ilvl="3" w:tplc="04100001" w:tentative="1">
+      <w:start w:val="1"/>
+      <w:numFmt w:val="bullet"/>
+      <w:lvlText w:val=""/>
+      <w:lvlJc w:val="left"/>
+      <w:pPr>
+        <w:ind w:left="5760" w:hanging="360"/>
+      </w:pPr>
+      <w:rPr>
+        <w:rFonts w:ascii="Symbol" w:hAnsi="Symbol" w:hint="default"/>
+      </w:rPr>
+    </w:lvl>
+    <w:lvl w:ilvl="4" w:tplc="04100003" w:tentative="1">
+      <w:start w:val="1"/>
+      <w:numFmt w:val="bullet"/>
+      <w:lvlText w:val="o"/>
+      <w:lvlJc w:val="left"/>
+      <w:pPr>
+        <w:ind w:left="6480" w:hanging="360"/>
+      </w:pPr>
+      <w:rPr>
+        <w:rFonts w:ascii="Courier New" w:hAnsi="Courier New" w:cs="Courier New" w:hint="default"/>
+      </w:rPr>
+    </w:lvl>
+    <w:lvl w:ilvl="5" w:tplc="04100005" w:tentative="1">
+      <w:start w:val="1"/>
+      <w:numFmt w:val="bullet"/>
+      <w:lvlText w:val=""/>
+      <w:lvlJc w:val="left"/>
+      <w:pPr>
+        <w:ind w:left="7200" w:hanging="360"/>
+      </w:pPr>
+      <w:rPr>
+        <w:rFonts w:ascii="Wingdings" w:hAnsi="Wingdings" w:hint="default"/>
+      </w:rPr>
+    </w:lvl>
+    <w:lvl w:ilvl="6" w:tplc="04100001" w:tentative="1">
+      <w:start w:val="1"/>
+      <w:numFmt w:val="bullet"/>
+      <w:lvlText w:val=""/>
+      <w:lvlJc w:val="left"/>
+      <w:pPr>
+        <w:ind w:left="7920" w:hanging="360"/>
+      </w:pPr>
+      <w:rPr>
+        <w:rFonts w:ascii="Symbol" w:hAnsi="Symbol" w:hint="default"/>
+      </w:rPr>
+    </w:lvl>
+    <w:lvl w:ilvl="7" w:tplc="04100003" w:tentative="1">
+      <w:start w:val="1"/>
+      <w:numFmt w:val="bullet"/>
+      <w:lvlText w:val="o"/>
+      <w:lvlJc w:val="left"/>
+      <w:pPr>
+        <w:ind w:left="8640" w:hanging="360"/>
+      </w:pPr>
+      <w:rPr>
+        <w:rFonts w:ascii="Courier New" w:hAnsi="Courier New" w:cs="Courier New" w:hint="default"/>
+      </w:rPr>
+    </w:lvl>
+    <w:lvl w:ilvl="8" w:tplc="04100005" w:tentative="1">
+      <w:start w:val="1"/>
+      <w:numFmt w:val="bullet"/>
+      <w:lvlText w:val=""/>
+      <w:lvlJc w:val="left"/>
+      <w:pPr>
+        <w:ind w:left="9360" w:hanging="360"/>
+      </w:pPr>
+      <w:rPr>
+        <w:rFonts w:ascii="Wingdings" w:hAnsi="Wingdings" w:hint="default"/>
+      </w:rPr>
+    </w:lvl>
+  </w:abstractNum>
+  <w:abstractNum w:abstractNumId="11" w15:restartNumberingAfterBreak="0">
+    <w:nsid w:val="6A5F0F1F"/>
+    <w:multiLevelType w:val="hybridMultilevel"/>
+    <w:tmpl w:val="7D4EA444"/>
+    <w:lvl w:ilvl="0" w:tplc="0410000F">
+      <w:start w:val="1"/>
+      <w:numFmt w:val="decimal"/>
+      <w:lvlText w:val="%1."/>
+      <w:lvlJc w:val="left"/>
+      <w:pPr>
+        <w:ind w:left="720" w:hanging="360"/>
+      </w:pPr>
+    </w:lvl>
+    <w:lvl w:ilvl="1" w:tplc="04100019" w:tentative="1">
+      <w:start w:val="1"/>
+      <w:numFmt w:val="lowerLetter"/>
+      <w:lvlText w:val="%2."/>
+      <w:lvlJc w:val="left"/>
+      <w:pPr>
+        <w:ind w:left="1440" w:hanging="360"/>
+      </w:pPr>
+    </w:lvl>
+    <w:lvl w:ilvl="2" w:tplc="0410001B" w:tentative="1">
+      <w:start w:val="1"/>
+      <w:numFmt w:val="lowerRoman"/>
+      <w:lvlText w:val="%3."/>
+      <w:lvlJc w:val="right"/>
+      <w:pPr>
+        <w:ind w:left="2160" w:hanging="180"/>
+      </w:pPr>
+    </w:lvl>
+    <w:lvl w:ilvl="3" w:tplc="0410000F" w:tentative="1">
+      <w:start w:val="1"/>
+      <w:numFmt w:val="decimal"/>
+      <w:lvlText w:val="%4."/>
+      <w:lvlJc w:val="left"/>
+      <w:pPr>
+        <w:ind w:left="2880" w:hanging="360"/>
+      </w:pPr>
+    </w:lvl>
+    <w:lvl w:ilvl="4" w:tplc="04100019" w:tentative="1">
+      <w:start w:val="1"/>
+      <w:numFmt w:val="lowerLetter"/>
+      <w:lvlText w:val="%5."/>
+      <w:lvlJc w:val="left"/>
+      <w:pPr>
+        <w:ind w:left="3600" w:hanging="360"/>
+      </w:pPr>
+    </w:lvl>
+    <w:lvl w:ilvl="5" w:tplc="0410001B" w:tentative="1">
+      <w:start w:val="1"/>
+      <w:numFmt w:val="lowerRoman"/>
+      <w:lvlText w:val="%6."/>
+      <w:lvlJc w:val="right"/>
+      <w:pPr>
+        <w:ind w:left="4320" w:hanging="180"/>
+      </w:pPr>
+    </w:lvl>
+    <w:lvl w:ilvl="6" w:tplc="0410000F" w:tentative="1">
+      <w:start w:val="1"/>
+      <w:numFmt w:val="decimal"/>
+      <w:lvlText w:val="%7."/>
+      <w:lvlJc w:val="left"/>
+      <w:pPr>
+        <w:ind w:left="5040" w:hanging="360"/>
+      </w:pPr>
+    </w:lvl>
+    <w:lvl w:ilvl="7" w:tplc="04100019" w:tentative="1">
+      <w:start w:val="1"/>
+      <w:numFmt w:val="lowerLetter"/>
+      <w:lvlText w:val="%8."/>
+      <w:lvlJc w:val="left"/>
+      <w:pPr>
+        <w:ind w:left="5760" w:hanging="360"/>
+      </w:pPr>
+    </w:lvl>
+    <w:lvl w:ilvl="8" w:tplc="0410001B" w:tentative="1">
+      <w:start w:val="1"/>
+      <w:numFmt w:val="lowerRoman"/>
+      <w:lvlText w:val="%9."/>
+      <w:lvlJc w:val="right"/>
+      <w:pPr>
+        <w:ind w:left="6480" w:hanging="180"/>
+      </w:pPr>
+    </w:lvl>
+  </w:abstractNum>
   <w:num w:numId="1" w16cid:durableId="516620846">
-    <w:abstractNumId w:val="5"/>
+    <w:abstractNumId w:val="9"/>
   </w:num>
   <w:num w:numId="2" w16cid:durableId="928078455">
     <w:abstractNumId w:val="0"/>
   </w:num>
   <w:num w:numId="3" w16cid:durableId="359208680">
-    <w:abstractNumId w:val="3"/>
+    <w:abstractNumId w:val="5"/>
   </w:num>
   <w:num w:numId="4" w16cid:durableId="1151364677">
     <w:abstractNumId w:val="2"/>
   </w:num>
   <w:num w:numId="5" w16cid:durableId="1012103315">
-    <w:abstractNumId w:val="4"/>
+    <w:abstractNumId w:val="6"/>
   </w:num>
   <w:num w:numId="6" w16cid:durableId="59713353">
     <w:abstractNumId w:val="1"/>
+  </w:num>
+  <w:num w:numId="7" w16cid:durableId="424612166">
+    <w:abstractNumId w:val="10"/>
+  </w:num>
+  <w:num w:numId="8" w16cid:durableId="1667705841">
+    <w:abstractNumId w:val="11"/>
+  </w:num>
+  <w:num w:numId="9" w16cid:durableId="1337197335">
+    <w:abstractNumId w:val="3"/>
+  </w:num>
+  <w:num w:numId="10" w16cid:durableId="773479294">
+    <w:abstractNumId w:val="4"/>
+  </w:num>
+  <w:num w:numId="11" w16cid:durableId="706836033">
+    <w:abstractNumId w:val="7"/>
+  </w:num>
+  <w:num w:numId="12" w16cid:durableId="896277477">
+    <w:abstractNumId w:val="8"/>
   </w:num>
 </w:numbering>
 </file>
@@ -3182,7 +5545,6 @@
   <w:style w:type="character" w:default="1" w:styleId="Carpredefinitoparagrafo">
     <w:name w:val="Default Paragraph Font"/>
     <w:uiPriority w:val="1"/>
-    <w:semiHidden/>
     <w:unhideWhenUsed/>
   </w:style>
   <w:style w:type="table" w:default="1" w:styleId="Tabellanormale">

</xml_diff>